<commit_message>
Pulling from master from github
</commit_message>
<xml_diff>
--- a/Documents/User Stories v2.docx
+++ b/Documents/User Stories v2.docx
@@ -299,77 +299,77 @@
                 <w:szCs w:val="20"/>
                 <w:rtl w:val="0"/>
               </w:rPr>
-              <w:t xml:space="preserve">Hand Input</w:t>
-            </w:r>
-          </w:p>
-        </w:tc>
-        <w:tc>
-          <w:tcPr>
-            <w:tcBorders>
-              <w:top w:color="cccccc" w:space="0" w:sz="6" w:val="single"/>
-              <w:left w:color="cccccc" w:space="0" w:sz="6" w:val="single"/>
-              <w:bottom w:color="cccccc" w:space="0" w:sz="6" w:val="single"/>
-              <w:right w:color="cccccc" w:space="0" w:sz="6" w:val="single"/>
-            </w:tcBorders>
-            <w:tcMar>
-              <w:top w:w="40.0" w:type="dxa"/>
-              <w:left w:w="40.0" w:type="dxa"/>
-              <w:bottom w:w="40.0" w:type="dxa"/>
-              <w:right w:w="40.0" w:type="dxa"/>
-            </w:tcMar>
-            <w:vAlign w:val="bottom"/>
-          </w:tcPr>
-          <w:p>
-            <w:pPr>
-              <w:widowControl w:val="0"/>
-              <w:jc w:val="center"/>
-              <w:rPr>
-                <w:sz w:val="20"/>
-                <w:szCs w:val="20"/>
-              </w:rPr>
-            </w:pPr>
-            <w:r>
-              <w:rPr>
-                <w:sz w:val="20"/>
-                <w:szCs w:val="20"/>
-                <w:rtl w:val="0"/>
-              </w:rPr>
-              <w:t xml:space="preserve">As a player, I want to input my cards and the board to get advice.</w:t>
-            </w:r>
-          </w:p>
-        </w:tc>
-        <w:tc>
-          <w:tcPr>
-            <w:tcBorders>
-              <w:top w:color="cccccc" w:space="0" w:sz="6" w:val="single"/>
-              <w:left w:color="cccccc" w:space="0" w:sz="6" w:val="single"/>
-              <w:bottom w:color="cccccc" w:space="0" w:sz="6" w:val="single"/>
-              <w:right w:color="cccccc" w:space="0" w:sz="6" w:val="single"/>
-            </w:tcBorders>
-            <w:tcMar>
-              <w:top w:w="40.0" w:type="dxa"/>
-              <w:left w:w="40.0" w:type="dxa"/>
-              <w:bottom w:w="40.0" w:type="dxa"/>
-              <w:right w:w="40.0" w:type="dxa"/>
-            </w:tcMar>
-            <w:vAlign w:val="bottom"/>
-          </w:tcPr>
-          <w:p>
-            <w:pPr>
-              <w:widowControl w:val="0"/>
-              <w:jc w:val="center"/>
-              <w:rPr>
-                <w:sz w:val="20"/>
-                <w:szCs w:val="20"/>
-              </w:rPr>
-            </w:pPr>
-            <w:r>
-              <w:rPr>
-                <w:sz w:val="20"/>
-                <w:szCs w:val="20"/>
-                <w:rtl w:val="0"/>
-              </w:rPr>
-              <w:t xml:space="preserve">1. Select cards from a UI. </w:t>
+              <w:t xml:space="preserve">Game Cards</w:t>
+            </w:r>
+          </w:p>
+        </w:tc>
+        <w:tc>
+          <w:tcPr>
+            <w:tcBorders>
+              <w:top w:color="cccccc" w:space="0" w:sz="6" w:val="single"/>
+              <w:left w:color="cccccc" w:space="0" w:sz="6" w:val="single"/>
+              <w:bottom w:color="cccccc" w:space="0" w:sz="6" w:val="single"/>
+              <w:right w:color="cccccc" w:space="0" w:sz="6" w:val="single"/>
+            </w:tcBorders>
+            <w:tcMar>
+              <w:top w:w="40.0" w:type="dxa"/>
+              <w:left w:w="40.0" w:type="dxa"/>
+              <w:bottom w:w="40.0" w:type="dxa"/>
+              <w:right w:w="40.0" w:type="dxa"/>
+            </w:tcMar>
+            <w:vAlign w:val="bottom"/>
+          </w:tcPr>
+          <w:p>
+            <w:pPr>
+              <w:widowControl w:val="0"/>
+              <w:jc w:val="center"/>
+              <w:rPr>
+                <w:sz w:val="20"/>
+                <w:szCs w:val="20"/>
+              </w:rPr>
+            </w:pPr>
+            <w:r>
+              <w:rPr>
+                <w:sz w:val="20"/>
+                <w:szCs w:val="20"/>
+                <w:rtl w:val="0"/>
+              </w:rPr>
+              <w:t xml:space="preserve">As a player, I want to see my cards and the table cards clearly on the screen.</w:t>
+            </w:r>
+          </w:p>
+        </w:tc>
+        <w:tc>
+          <w:tcPr>
+            <w:tcBorders>
+              <w:top w:color="cccccc" w:space="0" w:sz="6" w:val="single"/>
+              <w:left w:color="cccccc" w:space="0" w:sz="6" w:val="single"/>
+              <w:bottom w:color="cccccc" w:space="0" w:sz="6" w:val="single"/>
+              <w:right w:color="cccccc" w:space="0" w:sz="6" w:val="single"/>
+            </w:tcBorders>
+            <w:tcMar>
+              <w:top w:w="40.0" w:type="dxa"/>
+              <w:left w:w="40.0" w:type="dxa"/>
+              <w:bottom w:w="40.0" w:type="dxa"/>
+              <w:right w:w="40.0" w:type="dxa"/>
+            </w:tcMar>
+            <w:vAlign w:val="bottom"/>
+          </w:tcPr>
+          <w:p>
+            <w:pPr>
+              <w:widowControl w:val="0"/>
+              <w:jc w:val="center"/>
+              <w:rPr>
+                <w:sz w:val="20"/>
+                <w:szCs w:val="20"/>
+              </w:rPr>
+            </w:pPr>
+            <w:r>
+              <w:rPr>
+                <w:sz w:val="20"/>
+                <w:szCs w:val="20"/>
+                <w:rtl w:val="0"/>
+              </w:rPr>
+              <w:t xml:space="preserve">1. View cards on a UI. </w:t>
             </w:r>
           </w:p>
           <w:p>
@@ -572,6 +572,24 @@
               <w:t xml:space="preserve">1. Suggestions appear in a timely manner.</w:t>
             </w:r>
           </w:p>
+          <w:p>
+            <w:pPr>
+              <w:widowControl w:val="0"/>
+              <w:jc w:val="center"/>
+              <w:rPr>
+                <w:sz w:val="20"/>
+                <w:szCs w:val="20"/>
+              </w:rPr>
+            </w:pPr>
+            <w:r>
+              <w:rPr>
+                <w:sz w:val="20"/>
+                <w:szCs w:val="20"/>
+                <w:rtl w:val="0"/>
+              </w:rPr>
+              <w:t xml:space="preserve">2. Advice is clear, concise and accurate.</w:t>
+            </w:r>
+          </w:p>
         </w:tc>
         <w:tc>
           <w:tcPr>
@@ -681,95 +699,83 @@
                 <w:szCs w:val="20"/>
                 <w:rtl w:val="0"/>
               </w:rPr>
-              <w:t xml:space="preserve">Position Selection</w:t>
-            </w:r>
-          </w:p>
-        </w:tc>
-        <w:tc>
-          <w:tcPr>
-            <w:tcBorders>
-              <w:top w:color="cccccc" w:space="0" w:sz="6" w:val="single"/>
-              <w:left w:color="cccccc" w:space="0" w:sz="6" w:val="single"/>
-              <w:bottom w:color="cccccc" w:space="0" w:sz="6" w:val="single"/>
-              <w:right w:color="cccccc" w:space="0" w:sz="6" w:val="single"/>
-            </w:tcBorders>
-            <w:tcMar>
-              <w:top w:w="40.0" w:type="dxa"/>
-              <w:left w:w="40.0" w:type="dxa"/>
-              <w:bottom w:w="40.0" w:type="dxa"/>
-              <w:right w:w="40.0" w:type="dxa"/>
-            </w:tcMar>
-            <w:vAlign w:val="bottom"/>
-          </w:tcPr>
-          <w:p>
-            <w:pPr>
-              <w:widowControl w:val="0"/>
-              <w:jc w:val="center"/>
-              <w:rPr>
-                <w:sz w:val="20"/>
-                <w:szCs w:val="20"/>
-              </w:rPr>
-            </w:pPr>
-            <w:r>
-              <w:rPr>
-                <w:sz w:val="20"/>
-                <w:szCs w:val="20"/>
-                <w:rtl w:val="0"/>
-              </w:rPr>
-              <w:t xml:space="preserve">As a player, I want to set my table position (e.g., Button, SB).</w:t>
-            </w:r>
-          </w:p>
-        </w:tc>
-        <w:tc>
-          <w:tcPr>
-            <w:tcBorders>
-              <w:top w:color="cccccc" w:space="0" w:sz="6" w:val="single"/>
-              <w:left w:color="cccccc" w:space="0" w:sz="6" w:val="single"/>
-              <w:bottom w:color="cccccc" w:space="0" w:sz="6" w:val="single"/>
-              <w:right w:color="cccccc" w:space="0" w:sz="6" w:val="single"/>
-            </w:tcBorders>
-            <w:tcMar>
-              <w:top w:w="40.0" w:type="dxa"/>
-              <w:left w:w="40.0" w:type="dxa"/>
-              <w:bottom w:w="40.0" w:type="dxa"/>
-              <w:right w:w="40.0" w:type="dxa"/>
-            </w:tcMar>
-            <w:vAlign w:val="bottom"/>
-          </w:tcPr>
-          <w:p>
-            <w:pPr>
-              <w:widowControl w:val="0"/>
-              <w:jc w:val="center"/>
-              <w:rPr>
-                <w:sz w:val="20"/>
-                <w:szCs w:val="20"/>
-              </w:rPr>
-            </w:pPr>
-            <w:r>
-              <w:rPr>
-                <w:sz w:val="20"/>
-                <w:szCs w:val="20"/>
-                <w:rtl w:val="0"/>
-              </w:rPr>
-              <w:t xml:space="preserve">1. Dropdown for position. </w:t>
-            </w:r>
-          </w:p>
-          <w:p>
-            <w:pPr>
-              <w:widowControl w:val="0"/>
-              <w:jc w:val="center"/>
-              <w:rPr>
-                <w:sz w:val="20"/>
-                <w:szCs w:val="20"/>
-              </w:rPr>
-            </w:pPr>
-            <w:r>
-              <w:rPr>
-                <w:sz w:val="20"/>
-                <w:szCs w:val="20"/>
-                <w:rtl w:val="0"/>
-              </w:rPr>
-              <w:t xml:space="preserve">2. AI adjusts advice.</w:t>
+              <w:t xml:space="preserve">Position indicator</w:t>
+            </w:r>
+          </w:p>
+        </w:tc>
+        <w:tc>
+          <w:tcPr>
+            <w:tcBorders>
+              <w:top w:color="cccccc" w:space="0" w:sz="6" w:val="single"/>
+              <w:left w:color="cccccc" w:space="0" w:sz="6" w:val="single"/>
+              <w:bottom w:color="cccccc" w:space="0" w:sz="6" w:val="single"/>
+              <w:right w:color="cccccc" w:space="0" w:sz="6" w:val="single"/>
+            </w:tcBorders>
+            <w:tcMar>
+              <w:top w:w="40.0" w:type="dxa"/>
+              <w:left w:w="40.0" w:type="dxa"/>
+              <w:bottom w:w="40.0" w:type="dxa"/>
+              <w:right w:w="40.0" w:type="dxa"/>
+            </w:tcMar>
+            <w:vAlign w:val="bottom"/>
+          </w:tcPr>
+          <w:p>
+            <w:pPr>
+              <w:widowControl w:val="0"/>
+              <w:jc w:val="center"/>
+              <w:rPr>
+                <w:sz w:val="20"/>
+                <w:szCs w:val="20"/>
+              </w:rPr>
+            </w:pPr>
+            <w:r>
+              <w:rPr>
+                <w:sz w:val="20"/>
+                <w:szCs w:val="20"/>
+                <w:rtl w:val="0"/>
+              </w:rPr>
+              <w:t xml:space="preserve">As a player, I want a visual indicator of when it is my turn and who the blinds are. </w:t>
+            </w:r>
+          </w:p>
+        </w:tc>
+        <w:tc>
+          <w:tcPr>
+            <w:tcBorders>
+              <w:top w:color="cccccc" w:space="0" w:sz="6" w:val="single"/>
+              <w:left w:color="cccccc" w:space="0" w:sz="6" w:val="single"/>
+              <w:bottom w:color="cccccc" w:space="0" w:sz="6" w:val="single"/>
+              <w:right w:color="cccccc" w:space="0" w:sz="6" w:val="single"/>
+            </w:tcBorders>
+            <w:tcMar>
+              <w:top w:w="40.0" w:type="dxa"/>
+              <w:left w:w="40.0" w:type="dxa"/>
+              <w:bottom w:w="40.0" w:type="dxa"/>
+              <w:right w:w="40.0" w:type="dxa"/>
+            </w:tcMar>
+            <w:vAlign w:val="bottom"/>
+          </w:tcPr>
+          <w:p>
+            <w:pPr>
+              <w:widowControl w:val="0"/>
+              <w:numPr>
+                <w:ilvl w:val="0"/>
+                <w:numId w:val="3"/>
+              </w:numPr>
+              <w:ind w:left="1440" w:hanging="360"/>
+              <w:jc w:val="center"/>
+              <w:rPr>
+                <w:sz w:val="20"/>
+                <w:szCs w:val="20"/>
+                <w:u w:val="none"/>
+              </w:rPr>
+            </w:pPr>
+            <w:r>
+              <w:rPr>
+                <w:sz w:val="20"/>
+                <w:szCs w:val="20"/>
+                <w:rtl w:val="0"/>
+              </w:rPr>
+              <w:t xml:space="preserve">UI indicator on screen</w:t>
             </w:r>
           </w:p>
         </w:tc>
@@ -1081,95 +1087,107 @@
                 <w:szCs w:val="20"/>
                 <w:rtl w:val="0"/>
               </w:rPr>
-              <w:t xml:space="preserve">Save Hand</w:t>
-            </w:r>
-          </w:p>
-        </w:tc>
-        <w:tc>
-          <w:tcPr>
-            <w:tcBorders>
-              <w:top w:color="cccccc" w:space="0" w:sz="6" w:val="single"/>
-              <w:left w:color="cccccc" w:space="0" w:sz="6" w:val="single"/>
-              <w:bottom w:color="cccccc" w:space="0" w:sz="6" w:val="single"/>
-              <w:right w:color="cccccc" w:space="0" w:sz="6" w:val="single"/>
-            </w:tcBorders>
-            <w:tcMar>
-              <w:top w:w="40.0" w:type="dxa"/>
-              <w:left w:w="40.0" w:type="dxa"/>
-              <w:bottom w:w="40.0" w:type="dxa"/>
-              <w:right w:w="40.0" w:type="dxa"/>
-            </w:tcMar>
-            <w:vAlign w:val="bottom"/>
-          </w:tcPr>
-          <w:p>
-            <w:pPr>
-              <w:widowControl w:val="0"/>
-              <w:jc w:val="center"/>
-              <w:rPr>
-                <w:sz w:val="20"/>
-                <w:szCs w:val="20"/>
-              </w:rPr>
-            </w:pPr>
-            <w:r>
-              <w:rPr>
-                <w:sz w:val="20"/>
-                <w:szCs w:val="20"/>
-                <w:rtl w:val="0"/>
-              </w:rPr>
-              <w:t xml:space="preserve">As a user, I want to save interesting hands for later review.</w:t>
-            </w:r>
-          </w:p>
-        </w:tc>
-        <w:tc>
-          <w:tcPr>
-            <w:tcBorders>
-              <w:top w:color="cccccc" w:space="0" w:sz="6" w:val="single"/>
-              <w:left w:color="cccccc" w:space="0" w:sz="6" w:val="single"/>
-              <w:bottom w:color="cccccc" w:space="0" w:sz="6" w:val="single"/>
-              <w:right w:color="cccccc" w:space="0" w:sz="6" w:val="single"/>
-            </w:tcBorders>
-            <w:tcMar>
-              <w:top w:w="40.0" w:type="dxa"/>
-              <w:left w:w="40.0" w:type="dxa"/>
-              <w:bottom w:w="40.0" w:type="dxa"/>
-              <w:right w:w="40.0" w:type="dxa"/>
-            </w:tcMar>
-            <w:vAlign w:val="bottom"/>
-          </w:tcPr>
-          <w:p>
-            <w:pPr>
-              <w:widowControl w:val="0"/>
-              <w:jc w:val="center"/>
-              <w:rPr>
-                <w:sz w:val="20"/>
-                <w:szCs w:val="20"/>
-              </w:rPr>
-            </w:pPr>
-            <w:r>
-              <w:rPr>
-                <w:sz w:val="20"/>
-                <w:szCs w:val="20"/>
-                <w:rtl w:val="0"/>
-              </w:rPr>
-              <w:t xml:space="preserve">1. The save button is functional. </w:t>
-            </w:r>
-          </w:p>
-          <w:p>
-            <w:pPr>
-              <w:widowControl w:val="0"/>
-              <w:jc w:val="center"/>
-              <w:rPr>
-                <w:sz w:val="20"/>
-                <w:szCs w:val="20"/>
-              </w:rPr>
-            </w:pPr>
-            <w:r>
-              <w:rPr>
-                <w:sz w:val="20"/>
-                <w:szCs w:val="20"/>
-                <w:rtl w:val="0"/>
-              </w:rPr>
-              <w:t xml:space="preserve">2. Stored in history.</w:t>
+              <w:t xml:space="preserve">Winning Hand</w:t>
+            </w:r>
+          </w:p>
+        </w:tc>
+        <w:tc>
+          <w:tcPr>
+            <w:tcBorders>
+              <w:top w:color="cccccc" w:space="0" w:sz="6" w:val="single"/>
+              <w:left w:color="cccccc" w:space="0" w:sz="6" w:val="single"/>
+              <w:bottom w:color="cccccc" w:space="0" w:sz="6" w:val="single"/>
+              <w:right w:color="cccccc" w:space="0" w:sz="6" w:val="single"/>
+            </w:tcBorders>
+            <w:tcMar>
+              <w:top w:w="40.0" w:type="dxa"/>
+              <w:left w:w="40.0" w:type="dxa"/>
+              <w:bottom w:w="40.0" w:type="dxa"/>
+              <w:right w:w="40.0" w:type="dxa"/>
+            </w:tcMar>
+            <w:vAlign w:val="bottom"/>
+          </w:tcPr>
+          <w:p>
+            <w:pPr>
+              <w:widowControl w:val="0"/>
+              <w:jc w:val="center"/>
+              <w:rPr>
+                <w:sz w:val="20"/>
+                <w:szCs w:val="20"/>
+              </w:rPr>
+            </w:pPr>
+            <w:r>
+              <w:rPr>
+                <w:sz w:val="20"/>
+                <w:szCs w:val="20"/>
+                <w:rtl w:val="0"/>
+              </w:rPr>
+              <w:t xml:space="preserve">As a player, I want to a clear indicator of who won each round and what they won with.</w:t>
+            </w:r>
+          </w:p>
+        </w:tc>
+        <w:tc>
+          <w:tcPr>
+            <w:tcBorders>
+              <w:top w:color="cccccc" w:space="0" w:sz="6" w:val="single"/>
+              <w:left w:color="cccccc" w:space="0" w:sz="6" w:val="single"/>
+              <w:bottom w:color="cccccc" w:space="0" w:sz="6" w:val="single"/>
+              <w:right w:color="cccccc" w:space="0" w:sz="6" w:val="single"/>
+            </w:tcBorders>
+            <w:tcMar>
+              <w:top w:w="40.0" w:type="dxa"/>
+              <w:left w:w="40.0" w:type="dxa"/>
+              <w:bottom w:w="40.0" w:type="dxa"/>
+              <w:right w:w="40.0" w:type="dxa"/>
+            </w:tcMar>
+            <w:vAlign w:val="bottom"/>
+          </w:tcPr>
+          <w:p>
+            <w:pPr>
+              <w:widowControl w:val="0"/>
+              <w:numPr>
+                <w:ilvl w:val="0"/>
+                <w:numId w:val="5"/>
+              </w:numPr>
+              <w:ind w:left="720" w:hanging="360"/>
+              <w:jc w:val="center"/>
+              <w:rPr>
+                <w:sz w:val="20"/>
+                <w:szCs w:val="20"/>
+                <w:u w:val="none"/>
+              </w:rPr>
+            </w:pPr>
+            <w:r>
+              <w:rPr>
+                <w:sz w:val="20"/>
+                <w:szCs w:val="20"/>
+                <w:rtl w:val="0"/>
+              </w:rPr>
+              <w:t xml:space="preserve">Hand evaluation is rigorously tested and successful</w:t>
+            </w:r>
+          </w:p>
+          <w:p>
+            <w:pPr>
+              <w:widowControl w:val="0"/>
+              <w:numPr>
+                <w:ilvl w:val="0"/>
+                <w:numId w:val="5"/>
+              </w:numPr>
+              <w:ind w:left="720" w:hanging="360"/>
+              <w:jc w:val="center"/>
+              <w:rPr>
+                <w:sz w:val="20"/>
+                <w:szCs w:val="20"/>
+                <w:u w:val="none"/>
+              </w:rPr>
+            </w:pPr>
+            <w:r>
+              <w:rPr>
+                <w:sz w:val="20"/>
+                <w:szCs w:val="20"/>
+                <w:rtl w:val="0"/>
+              </w:rPr>
+              <w:t xml:space="preserve">UI element showing the round winner.</w:t>
             </w:r>
           </w:p>
         </w:tc>
@@ -1316,7 +1334,7 @@
                 <w:szCs w:val="20"/>
                 <w:rtl w:val="0"/>
               </w:rPr>
-              <w:t xml:space="preserve">As a player, I want to input my stack size in Big Blinds.</w:t>
+              <w:t xml:space="preserve">As a player, I want to see my chips on the game screen reflecting my balance.</w:t>
             </w:r>
           </w:p>
         </w:tc>
@@ -1663,77 +1681,77 @@
                 <w:szCs w:val="20"/>
                 <w:rtl w:val="0"/>
               </w:rPr>
-              <w:t xml:space="preserve">Opponent Profiling</w:t>
-            </w:r>
-          </w:p>
-        </w:tc>
-        <w:tc>
-          <w:tcPr>
-            <w:tcBorders>
-              <w:top w:color="cccccc" w:space="0" w:sz="6" w:val="single"/>
-              <w:left w:color="cccccc" w:space="0" w:sz="6" w:val="single"/>
-              <w:bottom w:color="cccccc" w:space="0" w:sz="6" w:val="single"/>
-              <w:right w:color="cccccc" w:space="0" w:sz="6" w:val="single"/>
-            </w:tcBorders>
-            <w:tcMar>
-              <w:top w:w="40.0" w:type="dxa"/>
-              <w:left w:w="40.0" w:type="dxa"/>
-              <w:bottom w:w="40.0" w:type="dxa"/>
-              <w:right w:w="40.0" w:type="dxa"/>
-            </w:tcMar>
-            <w:vAlign w:val="bottom"/>
-          </w:tcPr>
-          <w:p>
-            <w:pPr>
-              <w:widowControl w:val="0"/>
-              <w:jc w:val="center"/>
-              <w:rPr>
-                <w:sz w:val="20"/>
-                <w:szCs w:val="20"/>
-              </w:rPr>
-            </w:pPr>
-            <w:r>
-              <w:rPr>
-                <w:sz w:val="20"/>
-                <w:szCs w:val="20"/>
-                <w:rtl w:val="0"/>
-              </w:rPr>
-              <w:t xml:space="preserve">As a player, I want to tag opponents as Aggressive or Tight.</w:t>
-            </w:r>
-          </w:p>
-        </w:tc>
-        <w:tc>
-          <w:tcPr>
-            <w:tcBorders>
-              <w:top w:color="cccccc" w:space="0" w:sz="6" w:val="single"/>
-              <w:left w:color="cccccc" w:space="0" w:sz="6" w:val="single"/>
-              <w:bottom w:color="cccccc" w:space="0" w:sz="6" w:val="single"/>
-              <w:right w:color="cccccc" w:space="0" w:sz="6" w:val="single"/>
-            </w:tcBorders>
-            <w:tcMar>
-              <w:top w:w="40.0" w:type="dxa"/>
-              <w:left w:w="40.0" w:type="dxa"/>
-              <w:bottom w:w="40.0" w:type="dxa"/>
-              <w:right w:w="40.0" w:type="dxa"/>
-            </w:tcMar>
-            <w:vAlign w:val="bottom"/>
-          </w:tcPr>
-          <w:p>
-            <w:pPr>
-              <w:widowControl w:val="0"/>
-              <w:jc w:val="center"/>
-              <w:rPr>
-                <w:sz w:val="20"/>
-                <w:szCs w:val="20"/>
-              </w:rPr>
-            </w:pPr>
-            <w:r>
-              <w:rPr>
-                <w:sz w:val="20"/>
-                <w:szCs w:val="20"/>
-                <w:rtl w:val="0"/>
-              </w:rPr>
-              <w:t xml:space="preserve">1. Selection tags per opponent.</w:t>
+              <w:t xml:space="preserve">Difficulty setting</w:t>
+            </w:r>
+          </w:p>
+        </w:tc>
+        <w:tc>
+          <w:tcPr>
+            <w:tcBorders>
+              <w:top w:color="cccccc" w:space="0" w:sz="6" w:val="single"/>
+              <w:left w:color="cccccc" w:space="0" w:sz="6" w:val="single"/>
+              <w:bottom w:color="cccccc" w:space="0" w:sz="6" w:val="single"/>
+              <w:right w:color="cccccc" w:space="0" w:sz="6" w:val="single"/>
+            </w:tcBorders>
+            <w:tcMar>
+              <w:top w:w="40.0" w:type="dxa"/>
+              <w:left w:w="40.0" w:type="dxa"/>
+              <w:bottom w:w="40.0" w:type="dxa"/>
+              <w:right w:w="40.0" w:type="dxa"/>
+            </w:tcMar>
+            <w:vAlign w:val="bottom"/>
+          </w:tcPr>
+          <w:p>
+            <w:pPr>
+              <w:widowControl w:val="0"/>
+              <w:jc w:val="center"/>
+              <w:rPr>
+                <w:sz w:val="20"/>
+                <w:szCs w:val="20"/>
+              </w:rPr>
+            </w:pPr>
+            <w:r>
+              <w:rPr>
+                <w:sz w:val="20"/>
+                <w:szCs w:val="20"/>
+                <w:rtl w:val="0"/>
+              </w:rPr>
+              <w:t xml:space="preserve">As a player, I want to choose whether my opponents are Aggressive or risk averse.</w:t>
+            </w:r>
+          </w:p>
+        </w:tc>
+        <w:tc>
+          <w:tcPr>
+            <w:tcBorders>
+              <w:top w:color="cccccc" w:space="0" w:sz="6" w:val="single"/>
+              <w:left w:color="cccccc" w:space="0" w:sz="6" w:val="single"/>
+              <w:bottom w:color="cccccc" w:space="0" w:sz="6" w:val="single"/>
+              <w:right w:color="cccccc" w:space="0" w:sz="6" w:val="single"/>
+            </w:tcBorders>
+            <w:tcMar>
+              <w:top w:w="40.0" w:type="dxa"/>
+              <w:left w:w="40.0" w:type="dxa"/>
+              <w:bottom w:w="40.0" w:type="dxa"/>
+              <w:right w:w="40.0" w:type="dxa"/>
+            </w:tcMar>
+            <w:vAlign w:val="bottom"/>
+          </w:tcPr>
+          <w:p>
+            <w:pPr>
+              <w:widowControl w:val="0"/>
+              <w:jc w:val="center"/>
+              <w:rPr>
+                <w:sz w:val="20"/>
+                <w:szCs w:val="20"/>
+              </w:rPr>
+            </w:pPr>
+            <w:r>
+              <w:rPr>
+                <w:sz w:val="20"/>
+                <w:szCs w:val="20"/>
+                <w:rtl w:val="0"/>
+              </w:rPr>
+              <w:t xml:space="preserve">1. Difficulty selection on game startup.</w:t>
             </w:r>
           </w:p>
         </w:tc>
@@ -1845,77 +1863,83 @@
                 <w:szCs w:val="20"/>
                 <w:rtl w:val="0"/>
               </w:rPr>
-              <w:t xml:space="preserve">Offline Support</w:t>
-            </w:r>
-          </w:p>
-        </w:tc>
-        <w:tc>
-          <w:tcPr>
-            <w:tcBorders>
-              <w:top w:color="cccccc" w:space="0" w:sz="6" w:val="single"/>
-              <w:left w:color="cccccc" w:space="0" w:sz="6" w:val="single"/>
-              <w:bottom w:color="cccccc" w:space="0" w:sz="6" w:val="single"/>
-              <w:right w:color="cccccc" w:space="0" w:sz="6" w:val="single"/>
-            </w:tcBorders>
-            <w:tcMar>
-              <w:top w:w="40.0" w:type="dxa"/>
-              <w:left w:w="40.0" w:type="dxa"/>
-              <w:bottom w:w="40.0" w:type="dxa"/>
-              <w:right w:w="40.0" w:type="dxa"/>
-            </w:tcMar>
-            <w:vAlign w:val="bottom"/>
-          </w:tcPr>
-          <w:p>
-            <w:pPr>
-              <w:widowControl w:val="0"/>
-              <w:jc w:val="center"/>
-              <w:rPr>
-                <w:sz w:val="20"/>
-                <w:szCs w:val="20"/>
-              </w:rPr>
-            </w:pPr>
-            <w:r>
-              <w:rPr>
-                <w:sz w:val="20"/>
-                <w:szCs w:val="20"/>
-                <w:rtl w:val="0"/>
-              </w:rPr>
-              <w:t xml:space="preserve">As a user, I want to input hands while offline.</w:t>
-            </w:r>
-          </w:p>
-        </w:tc>
-        <w:tc>
-          <w:tcPr>
-            <w:tcBorders>
-              <w:top w:color="cccccc" w:space="0" w:sz="6" w:val="single"/>
-              <w:left w:color="cccccc" w:space="0" w:sz="6" w:val="single"/>
-              <w:bottom w:color="cccccc" w:space="0" w:sz="6" w:val="single"/>
-              <w:right w:color="cccccc" w:space="0" w:sz="6" w:val="single"/>
-            </w:tcBorders>
-            <w:tcMar>
-              <w:top w:w="40.0" w:type="dxa"/>
-              <w:left w:w="40.0" w:type="dxa"/>
-              <w:bottom w:w="40.0" w:type="dxa"/>
-              <w:right w:w="40.0" w:type="dxa"/>
-            </w:tcMar>
-            <w:vAlign w:val="bottom"/>
-          </w:tcPr>
-          <w:p>
-            <w:pPr>
-              <w:widowControl w:val="0"/>
-              <w:jc w:val="center"/>
-              <w:rPr>
-                <w:sz w:val="20"/>
-                <w:szCs w:val="20"/>
-              </w:rPr>
-            </w:pPr>
-            <w:r>
-              <w:rPr>
-                <w:sz w:val="20"/>
-                <w:szCs w:val="20"/>
-                <w:rtl w:val="0"/>
-              </w:rPr>
-              <w:t xml:space="preserve">1. Local storage is used when there is no internet.</w:t>
+              <w:t xml:space="preserve">Player stats</w:t>
+            </w:r>
+          </w:p>
+        </w:tc>
+        <w:tc>
+          <w:tcPr>
+            <w:tcBorders>
+              <w:top w:color="cccccc" w:space="0" w:sz="6" w:val="single"/>
+              <w:left w:color="cccccc" w:space="0" w:sz="6" w:val="single"/>
+              <w:bottom w:color="cccccc" w:space="0" w:sz="6" w:val="single"/>
+              <w:right w:color="cccccc" w:space="0" w:sz="6" w:val="single"/>
+            </w:tcBorders>
+            <w:tcMar>
+              <w:top w:w="40.0" w:type="dxa"/>
+              <w:left w:w="40.0" w:type="dxa"/>
+              <w:bottom w:w="40.0" w:type="dxa"/>
+              <w:right w:w="40.0" w:type="dxa"/>
+            </w:tcMar>
+            <w:vAlign w:val="bottom"/>
+          </w:tcPr>
+          <w:p>
+            <w:pPr>
+              <w:widowControl w:val="0"/>
+              <w:jc w:val="center"/>
+              <w:rPr>
+                <w:sz w:val="20"/>
+                <w:szCs w:val="20"/>
+              </w:rPr>
+            </w:pPr>
+            <w:r>
+              <w:rPr>
+                <w:sz w:val="20"/>
+                <w:szCs w:val="20"/>
+                <w:rtl w:val="0"/>
+              </w:rPr>
+              <w:t xml:space="preserve">As a user, I want to see my balance and hands played statistics</w:t>
+            </w:r>
+          </w:p>
+        </w:tc>
+        <w:tc>
+          <w:tcPr>
+            <w:tcBorders>
+              <w:top w:color="cccccc" w:space="0" w:sz="6" w:val="single"/>
+              <w:left w:color="cccccc" w:space="0" w:sz="6" w:val="single"/>
+              <w:bottom w:color="cccccc" w:space="0" w:sz="6" w:val="single"/>
+              <w:right w:color="cccccc" w:space="0" w:sz="6" w:val="single"/>
+            </w:tcBorders>
+            <w:tcMar>
+              <w:top w:w="40.0" w:type="dxa"/>
+              <w:left w:w="40.0" w:type="dxa"/>
+              <w:bottom w:w="40.0" w:type="dxa"/>
+              <w:right w:w="40.0" w:type="dxa"/>
+            </w:tcMar>
+            <w:vAlign w:val="bottom"/>
+          </w:tcPr>
+          <w:p>
+            <w:pPr>
+              <w:widowControl w:val="0"/>
+              <w:numPr>
+                <w:ilvl w:val="0"/>
+                <w:numId w:val="7"/>
+              </w:numPr>
+              <w:ind w:left="720" w:hanging="360"/>
+              <w:jc w:val="center"/>
+              <w:rPr>
+                <w:sz w:val="20"/>
+                <w:szCs w:val="20"/>
+                <w:u w:val="none"/>
+              </w:rPr>
+            </w:pPr>
+            <w:r>
+              <w:rPr>
+                <w:sz w:val="20"/>
+                <w:szCs w:val="20"/>
+                <w:rtl w:val="0"/>
+              </w:rPr>
+              <w:t xml:space="preserve">Profile page for users with relevant stats from db</w:t>
             </w:r>
           </w:p>
         </w:tc>
@@ -2391,77 +2415,83 @@
                 <w:szCs w:val="20"/>
                 <w:rtl w:val="0"/>
               </w:rPr>
-              <w:t xml:space="preserve">Tournament Tracker</w:t>
-            </w:r>
-          </w:p>
-        </w:tc>
-        <w:tc>
-          <w:tcPr>
-            <w:tcBorders>
-              <w:top w:color="cccccc" w:space="0" w:sz="6" w:val="single"/>
-              <w:left w:color="cccccc" w:space="0" w:sz="6" w:val="single"/>
-              <w:bottom w:color="cccccc" w:space="0" w:sz="6" w:val="single"/>
-              <w:right w:color="cccccc" w:space="0" w:sz="6" w:val="single"/>
-            </w:tcBorders>
-            <w:tcMar>
-              <w:top w:w="40.0" w:type="dxa"/>
-              <w:left w:w="40.0" w:type="dxa"/>
-              <w:bottom w:w="40.0" w:type="dxa"/>
-              <w:right w:w="40.0" w:type="dxa"/>
-            </w:tcMar>
-            <w:vAlign w:val="bottom"/>
-          </w:tcPr>
-          <w:p>
-            <w:pPr>
-              <w:widowControl w:val="0"/>
-              <w:jc w:val="center"/>
-              <w:rPr>
-                <w:sz w:val="20"/>
-                <w:szCs w:val="20"/>
-              </w:rPr>
-            </w:pPr>
-            <w:r>
-              <w:rPr>
-                <w:sz w:val="20"/>
-                <w:szCs w:val="20"/>
-                <w:rtl w:val="0"/>
-              </w:rPr>
-              <w:t xml:space="preserve">As a user, I want to log my tournament finishes.</w:t>
-            </w:r>
-          </w:p>
-        </w:tc>
-        <w:tc>
-          <w:tcPr>
-            <w:tcBorders>
-              <w:top w:color="cccccc" w:space="0" w:sz="6" w:val="single"/>
-              <w:left w:color="cccccc" w:space="0" w:sz="6" w:val="single"/>
-              <w:bottom w:color="cccccc" w:space="0" w:sz="6" w:val="single"/>
-              <w:right w:color="cccccc" w:space="0" w:sz="6" w:val="single"/>
-            </w:tcBorders>
-            <w:tcMar>
-              <w:top w:w="40.0" w:type="dxa"/>
-              <w:left w:w="40.0" w:type="dxa"/>
-              <w:bottom w:w="40.0" w:type="dxa"/>
-              <w:right w:w="40.0" w:type="dxa"/>
-            </w:tcMar>
-            <w:vAlign w:val="bottom"/>
-          </w:tcPr>
-          <w:p>
-            <w:pPr>
-              <w:widowControl w:val="0"/>
-              <w:jc w:val="center"/>
-              <w:rPr>
-                <w:sz w:val="20"/>
-                <w:szCs w:val="20"/>
-              </w:rPr>
-            </w:pPr>
-            <w:r>
-              <w:rPr>
-                <w:sz w:val="20"/>
-                <w:szCs w:val="20"/>
-                <w:rtl w:val="0"/>
-              </w:rPr>
-              <w:t xml:space="preserve">1. P/L tracking on profile.</w:t>
+              <w:t xml:space="preserve">Password hashing</w:t>
+            </w:r>
+          </w:p>
+        </w:tc>
+        <w:tc>
+          <w:tcPr>
+            <w:tcBorders>
+              <w:top w:color="cccccc" w:space="0" w:sz="6" w:val="single"/>
+              <w:left w:color="cccccc" w:space="0" w:sz="6" w:val="single"/>
+              <w:bottom w:color="cccccc" w:space="0" w:sz="6" w:val="single"/>
+              <w:right w:color="cccccc" w:space="0" w:sz="6" w:val="single"/>
+            </w:tcBorders>
+            <w:tcMar>
+              <w:top w:w="40.0" w:type="dxa"/>
+              <w:left w:w="40.0" w:type="dxa"/>
+              <w:bottom w:w="40.0" w:type="dxa"/>
+              <w:right w:w="40.0" w:type="dxa"/>
+            </w:tcMar>
+            <w:vAlign w:val="bottom"/>
+          </w:tcPr>
+          <w:p>
+            <w:pPr>
+              <w:widowControl w:val="0"/>
+              <w:jc w:val="center"/>
+              <w:rPr>
+                <w:sz w:val="20"/>
+                <w:szCs w:val="20"/>
+              </w:rPr>
+            </w:pPr>
+            <w:r>
+              <w:rPr>
+                <w:sz w:val="20"/>
+                <w:szCs w:val="20"/>
+                <w:rtl w:val="0"/>
+              </w:rPr>
+              <w:t xml:space="preserve">As a user, I want to register with an email and password and know my data is stored securely.</w:t>
+            </w:r>
+          </w:p>
+        </w:tc>
+        <w:tc>
+          <w:tcPr>
+            <w:tcBorders>
+              <w:top w:color="cccccc" w:space="0" w:sz="6" w:val="single"/>
+              <w:left w:color="cccccc" w:space="0" w:sz="6" w:val="single"/>
+              <w:bottom w:color="cccccc" w:space="0" w:sz="6" w:val="single"/>
+              <w:right w:color="cccccc" w:space="0" w:sz="6" w:val="single"/>
+            </w:tcBorders>
+            <w:tcMar>
+              <w:top w:w="40.0" w:type="dxa"/>
+              <w:left w:w="40.0" w:type="dxa"/>
+              <w:bottom w:w="40.0" w:type="dxa"/>
+              <w:right w:w="40.0" w:type="dxa"/>
+            </w:tcMar>
+            <w:vAlign w:val="bottom"/>
+          </w:tcPr>
+          <w:p>
+            <w:pPr>
+              <w:widowControl w:val="0"/>
+              <w:numPr>
+                <w:ilvl w:val="0"/>
+                <w:numId w:val="6"/>
+              </w:numPr>
+              <w:ind w:left="720" w:hanging="360"/>
+              <w:jc w:val="center"/>
+              <w:rPr>
+                <w:sz w:val="20"/>
+                <w:szCs w:val="20"/>
+                <w:u w:val="none"/>
+              </w:rPr>
+            </w:pPr>
+            <w:r>
+              <w:rPr>
+                <w:sz w:val="20"/>
+                <w:szCs w:val="20"/>
+                <w:rtl w:val="0"/>
+              </w:rPr>
+              <w:t xml:space="preserve">Hashing tool for user data</w:t>
             </w:r>
           </w:p>
         </w:tc>
@@ -2573,112 +2603,118 @@
                 <w:szCs w:val="20"/>
                 <w:rtl w:val="0"/>
               </w:rPr>
-              <w:t xml:space="preserve">Hand Notes</w:t>
-            </w:r>
-          </w:p>
-        </w:tc>
-        <w:tc>
-          <w:tcPr>
-            <w:tcBorders>
-              <w:top w:color="cccccc" w:space="0" w:sz="6" w:val="single"/>
-              <w:left w:color="cccccc" w:space="0" w:sz="6" w:val="single"/>
-              <w:bottom w:color="cccccc" w:space="0" w:sz="6" w:val="single"/>
-              <w:right w:color="cccccc" w:space="0" w:sz="6" w:val="single"/>
-            </w:tcBorders>
-            <w:tcMar>
-              <w:top w:w="40.0" w:type="dxa"/>
-              <w:left w:w="40.0" w:type="dxa"/>
-              <w:bottom w:w="40.0" w:type="dxa"/>
-              <w:right w:w="40.0" w:type="dxa"/>
-            </w:tcMar>
-            <w:vAlign w:val="bottom"/>
-          </w:tcPr>
-          <w:p>
-            <w:pPr>
-              <w:widowControl w:val="0"/>
-              <w:jc w:val="center"/>
-              <w:rPr>
-                <w:sz w:val="20"/>
-                <w:szCs w:val="20"/>
-              </w:rPr>
-            </w:pPr>
-            <w:r>
-              <w:rPr>
-                <w:sz w:val="20"/>
-                <w:szCs w:val="20"/>
-                <w:rtl w:val="0"/>
-              </w:rPr>
-              <w:t xml:space="preserve">As a player, I want to add custom notes to saved hands.</w:t>
-            </w:r>
-          </w:p>
-        </w:tc>
-        <w:tc>
-          <w:tcPr>
-            <w:tcBorders>
-              <w:top w:color="cccccc" w:space="0" w:sz="6" w:val="single"/>
-              <w:left w:color="cccccc" w:space="0" w:sz="6" w:val="single"/>
-              <w:bottom w:color="cccccc" w:space="0" w:sz="6" w:val="single"/>
-              <w:right w:color="cccccc" w:space="0" w:sz="6" w:val="single"/>
-            </w:tcBorders>
-            <w:tcMar>
-              <w:top w:w="40.0" w:type="dxa"/>
-              <w:left w:w="40.0" w:type="dxa"/>
-              <w:bottom w:w="40.0" w:type="dxa"/>
-              <w:right w:w="40.0" w:type="dxa"/>
-            </w:tcMar>
-            <w:vAlign w:val="bottom"/>
-          </w:tcPr>
-          <w:p>
-            <w:pPr>
-              <w:widowControl w:val="0"/>
-              <w:jc w:val="center"/>
-              <w:rPr>
-                <w:sz w:val="20"/>
-                <w:szCs w:val="20"/>
-              </w:rPr>
-            </w:pPr>
-            <w:r>
-              <w:rPr>
-                <w:sz w:val="20"/>
-                <w:szCs w:val="20"/>
-                <w:rtl w:val="0"/>
-              </w:rPr>
-              <w:t xml:space="preserve">1. Text field in hand details.</w:t>
-            </w:r>
-          </w:p>
-        </w:tc>
-        <w:tc>
-          <w:tcPr>
-            <w:tcBorders>
-              <w:top w:color="cccccc" w:space="0" w:sz="6" w:val="single"/>
-              <w:left w:color="cccccc" w:space="0" w:sz="6" w:val="single"/>
-              <w:bottom w:color="cccccc" w:space="0" w:sz="6" w:val="single"/>
-              <w:right w:color="cccccc" w:space="0" w:sz="6" w:val="single"/>
-            </w:tcBorders>
-            <w:tcMar>
-              <w:top w:w="40.0" w:type="dxa"/>
-              <w:left w:w="40.0" w:type="dxa"/>
-              <w:bottom w:w="40.0" w:type="dxa"/>
-              <w:right w:w="40.0" w:type="dxa"/>
-            </w:tcMar>
-            <w:vAlign w:val="bottom"/>
-          </w:tcPr>
-          <w:p>
-            <w:pPr>
-              <w:widowControl w:val="0"/>
-              <w:jc w:val="center"/>
-              <w:rPr>
-                <w:sz w:val="20"/>
-                <w:szCs w:val="20"/>
-              </w:rPr>
-            </w:pPr>
-            <w:r>
-              <w:rPr>
-                <w:sz w:val="20"/>
-                <w:szCs w:val="20"/>
-                <w:rtl w:val="0"/>
-              </w:rPr>
-              <w:t xml:space="preserve">Could-Have</w:t>
+              <w:t xml:space="preserve">Database Persistence</w:t>
+            </w:r>
+          </w:p>
+        </w:tc>
+        <w:tc>
+          <w:tcPr>
+            <w:tcBorders>
+              <w:top w:color="cccccc" w:space="0" w:sz="6" w:val="single"/>
+              <w:left w:color="cccccc" w:space="0" w:sz="6" w:val="single"/>
+              <w:bottom w:color="cccccc" w:space="0" w:sz="6" w:val="single"/>
+              <w:right w:color="cccccc" w:space="0" w:sz="6" w:val="single"/>
+            </w:tcBorders>
+            <w:tcMar>
+              <w:top w:w="40.0" w:type="dxa"/>
+              <w:left w:w="40.0" w:type="dxa"/>
+              <w:bottom w:w="40.0" w:type="dxa"/>
+              <w:right w:w="40.0" w:type="dxa"/>
+            </w:tcMar>
+            <w:vAlign w:val="bottom"/>
+          </w:tcPr>
+          <w:p>
+            <w:pPr>
+              <w:widowControl w:val="0"/>
+              <w:jc w:val="center"/>
+              <w:rPr>
+                <w:sz w:val="20"/>
+                <w:szCs w:val="20"/>
+              </w:rPr>
+            </w:pPr>
+            <w:r>
+              <w:rPr>
+                <w:sz w:val="20"/>
+                <w:szCs w:val="20"/>
+                <w:rtl w:val="0"/>
+              </w:rPr>
+              <w:t xml:space="preserve">As a player I want my account including balance and statistics to carry over between games</w:t>
+            </w:r>
+          </w:p>
+        </w:tc>
+        <w:tc>
+          <w:tcPr>
+            <w:tcBorders>
+              <w:top w:color="cccccc" w:space="0" w:sz="6" w:val="single"/>
+              <w:left w:color="cccccc" w:space="0" w:sz="6" w:val="single"/>
+              <w:bottom w:color="cccccc" w:space="0" w:sz="6" w:val="single"/>
+              <w:right w:color="cccccc" w:space="0" w:sz="6" w:val="single"/>
+            </w:tcBorders>
+            <w:tcMar>
+              <w:top w:w="40.0" w:type="dxa"/>
+              <w:left w:w="40.0" w:type="dxa"/>
+              <w:bottom w:w="40.0" w:type="dxa"/>
+              <w:right w:w="40.0" w:type="dxa"/>
+            </w:tcMar>
+            <w:vAlign w:val="bottom"/>
+          </w:tcPr>
+          <w:p>
+            <w:pPr>
+              <w:widowControl w:val="0"/>
+              <w:numPr>
+                <w:ilvl w:val="0"/>
+                <w:numId w:val="4"/>
+              </w:numPr>
+              <w:ind w:left="720" w:hanging="360"/>
+              <w:jc w:val="center"/>
+              <w:rPr>
+                <w:sz w:val="20"/>
+                <w:szCs w:val="20"/>
+                <w:u w:val="none"/>
+              </w:rPr>
+            </w:pPr>
+            <w:r>
+              <w:rPr>
+                <w:sz w:val="20"/>
+                <w:szCs w:val="20"/>
+                <w:rtl w:val="0"/>
+              </w:rPr>
+              <w:t xml:space="preserve">Persistent data base</w:t>
+            </w:r>
+          </w:p>
+        </w:tc>
+        <w:tc>
+          <w:tcPr>
+            <w:tcBorders>
+              <w:top w:color="cccccc" w:space="0" w:sz="6" w:val="single"/>
+              <w:left w:color="cccccc" w:space="0" w:sz="6" w:val="single"/>
+              <w:bottom w:color="cccccc" w:space="0" w:sz="6" w:val="single"/>
+              <w:right w:color="cccccc" w:space="0" w:sz="6" w:val="single"/>
+            </w:tcBorders>
+            <w:tcMar>
+              <w:top w:w="40.0" w:type="dxa"/>
+              <w:left w:w="40.0" w:type="dxa"/>
+              <w:bottom w:w="40.0" w:type="dxa"/>
+              <w:right w:w="40.0" w:type="dxa"/>
+            </w:tcMar>
+            <w:vAlign w:val="bottom"/>
+          </w:tcPr>
+          <w:p>
+            <w:pPr>
+              <w:widowControl w:val="0"/>
+              <w:jc w:val="center"/>
+              <w:rPr>
+                <w:sz w:val="20"/>
+                <w:szCs w:val="20"/>
+              </w:rPr>
+            </w:pPr>
+            <w:r>
+              <w:rPr>
+                <w:sz w:val="20"/>
+                <w:szCs w:val="20"/>
+                <w:rtl w:val="0"/>
+              </w:rPr>
+              <w:t xml:space="preserve">Must-have</w:t>
             </w:r>
           </w:p>
         </w:tc>
@@ -2790,42 +2826,72 @@
                 <w:szCs w:val="20"/>
                 <w:rtl w:val="0"/>
               </w:rPr>
-              <w:t xml:space="preserve">As a user, I want to see how long I have been playing.</w:t>
-            </w:r>
-          </w:p>
-        </w:tc>
-        <w:tc>
-          <w:tcPr>
-            <w:tcBorders>
-              <w:top w:color="cccccc" w:space="0" w:sz="6" w:val="single"/>
-              <w:left w:color="cccccc" w:space="0" w:sz="6" w:val="single"/>
-              <w:bottom w:color="cccccc" w:space="0" w:sz="6" w:val="single"/>
-              <w:right w:color="cccccc" w:space="0" w:sz="6" w:val="single"/>
-            </w:tcBorders>
-            <w:tcMar>
-              <w:top w:w="40.0" w:type="dxa"/>
-              <w:left w:w="40.0" w:type="dxa"/>
-              <w:bottom w:w="40.0" w:type="dxa"/>
-              <w:right w:w="40.0" w:type="dxa"/>
-            </w:tcMar>
-            <w:vAlign w:val="bottom"/>
-          </w:tcPr>
-          <w:p>
-            <w:pPr>
-              <w:widowControl w:val="0"/>
-              <w:jc w:val="center"/>
-              <w:rPr>
-                <w:sz w:val="20"/>
-                <w:szCs w:val="20"/>
-              </w:rPr>
-            </w:pPr>
-            <w:r>
-              <w:rPr>
-                <w:sz w:val="20"/>
-                <w:szCs w:val="20"/>
-                <w:rtl w:val="0"/>
-              </w:rPr>
-              <w:t xml:space="preserve">1. Visible timer in the dashboard.</w:t>
+              <w:t xml:space="preserve">As a user, I want to limit the length of a game.</w:t>
+            </w:r>
+          </w:p>
+        </w:tc>
+        <w:tc>
+          <w:tcPr>
+            <w:tcBorders>
+              <w:top w:color="cccccc" w:space="0" w:sz="6" w:val="single"/>
+              <w:left w:color="cccccc" w:space="0" w:sz="6" w:val="single"/>
+              <w:bottom w:color="cccccc" w:space="0" w:sz="6" w:val="single"/>
+              <w:right w:color="cccccc" w:space="0" w:sz="6" w:val="single"/>
+            </w:tcBorders>
+            <w:tcMar>
+              <w:top w:w="40.0" w:type="dxa"/>
+              <w:left w:w="40.0" w:type="dxa"/>
+              <w:bottom w:w="40.0" w:type="dxa"/>
+              <w:right w:w="40.0" w:type="dxa"/>
+            </w:tcMar>
+            <w:vAlign w:val="bottom"/>
+          </w:tcPr>
+          <w:p>
+            <w:pPr>
+              <w:widowControl w:val="0"/>
+              <w:numPr>
+                <w:ilvl w:val="0"/>
+                <w:numId w:val="2"/>
+              </w:numPr>
+              <w:ind w:left="720" w:hanging="360"/>
+              <w:jc w:val="center"/>
+              <w:rPr>
+                <w:sz w:val="20"/>
+                <w:szCs w:val="20"/>
+                <w:u w:val="none"/>
+              </w:rPr>
+            </w:pPr>
+            <w:r>
+              <w:rPr>
+                <w:sz w:val="20"/>
+                <w:szCs w:val="20"/>
+                <w:rtl w:val="0"/>
+              </w:rPr>
+              <w:t xml:space="preserve">Rounds played indicator.</w:t>
+            </w:r>
+          </w:p>
+          <w:p>
+            <w:pPr>
+              <w:widowControl w:val="0"/>
+              <w:numPr>
+                <w:ilvl w:val="0"/>
+                <w:numId w:val="2"/>
+              </w:numPr>
+              <w:ind w:left="720" w:hanging="360"/>
+              <w:jc w:val="center"/>
+              <w:rPr>
+                <w:sz w:val="20"/>
+                <w:szCs w:val="20"/>
+                <w:u w:val="none"/>
+              </w:rPr>
+            </w:pPr>
+            <w:r>
+              <w:rPr>
+                <w:sz w:val="20"/>
+                <w:szCs w:val="20"/>
+                <w:rtl w:val="0"/>
+              </w:rPr>
+              <w:t xml:space="preserve">User selects how many rounds to play before game starts.</w:t>
             </w:r>
           </w:p>
         </w:tc>
@@ -2937,7 +3003,7 @@
                 <w:szCs w:val="20"/>
                 <w:rtl w:val="0"/>
               </w:rPr>
-              <w:t xml:space="preserve">Custom Card Decks</w:t>
+              <w:t xml:space="preserve">Custom Card Backs</w:t>
             </w:r>
           </w:p>
         </w:tc>
@@ -3119,112 +3185,118 @@
                 <w:szCs w:val="20"/>
                 <w:rtl w:val="0"/>
               </w:rPr>
-              <w:t xml:space="preserve">Search &amp; Filter</w:t>
-            </w:r>
-          </w:p>
-        </w:tc>
-        <w:tc>
-          <w:tcPr>
-            <w:tcBorders>
-              <w:top w:color="cccccc" w:space="0" w:sz="6" w:val="single"/>
-              <w:left w:color="cccccc" w:space="0" w:sz="6" w:val="single"/>
-              <w:bottom w:color="cccccc" w:space="0" w:sz="6" w:val="single"/>
-              <w:right w:color="cccccc" w:space="0" w:sz="6" w:val="single"/>
-            </w:tcBorders>
-            <w:tcMar>
-              <w:top w:w="40.0" w:type="dxa"/>
-              <w:left w:w="40.0" w:type="dxa"/>
-              <w:bottom w:w="40.0" w:type="dxa"/>
-              <w:right w:w="40.0" w:type="dxa"/>
-            </w:tcMar>
-            <w:vAlign w:val="bottom"/>
-          </w:tcPr>
-          <w:p>
-            <w:pPr>
-              <w:widowControl w:val="0"/>
-              <w:jc w:val="center"/>
-              <w:rPr>
-                <w:sz w:val="20"/>
-                <w:szCs w:val="20"/>
-              </w:rPr>
-            </w:pPr>
-            <w:r>
-              <w:rPr>
-                <w:sz w:val="20"/>
-                <w:szCs w:val="20"/>
-                <w:rtl w:val="0"/>
-              </w:rPr>
-              <w:t xml:space="preserve">As a user, I want to search my history by keyword or date.</w:t>
-            </w:r>
-          </w:p>
-        </w:tc>
-        <w:tc>
-          <w:tcPr>
-            <w:tcBorders>
-              <w:top w:color="cccccc" w:space="0" w:sz="6" w:val="single"/>
-              <w:left w:color="cccccc" w:space="0" w:sz="6" w:val="single"/>
-              <w:bottom w:color="cccccc" w:space="0" w:sz="6" w:val="single"/>
-              <w:right w:color="cccccc" w:space="0" w:sz="6" w:val="single"/>
-            </w:tcBorders>
-            <w:tcMar>
-              <w:top w:w="40.0" w:type="dxa"/>
-              <w:left w:w="40.0" w:type="dxa"/>
-              <w:bottom w:w="40.0" w:type="dxa"/>
-              <w:right w:w="40.0" w:type="dxa"/>
-            </w:tcMar>
-            <w:vAlign w:val="bottom"/>
-          </w:tcPr>
-          <w:p>
-            <w:pPr>
-              <w:widowControl w:val="0"/>
-              <w:jc w:val="center"/>
-              <w:rPr>
-                <w:sz w:val="20"/>
-                <w:szCs w:val="20"/>
-              </w:rPr>
-            </w:pPr>
-            <w:r>
-              <w:rPr>
-                <w:sz w:val="20"/>
-                <w:szCs w:val="20"/>
-                <w:rtl w:val="0"/>
-              </w:rPr>
-              <w:t xml:space="preserve">1. Functional search bar in history.</w:t>
-            </w:r>
-          </w:p>
-        </w:tc>
-        <w:tc>
-          <w:tcPr>
-            <w:tcBorders>
-              <w:top w:color="cccccc" w:space="0" w:sz="6" w:val="single"/>
-              <w:left w:color="cccccc" w:space="0" w:sz="6" w:val="single"/>
-              <w:bottom w:color="cccccc" w:space="0" w:sz="6" w:val="single"/>
-              <w:right w:color="cccccc" w:space="0" w:sz="6" w:val="single"/>
-            </w:tcBorders>
-            <w:tcMar>
-              <w:top w:w="40.0" w:type="dxa"/>
-              <w:left w:w="40.0" w:type="dxa"/>
-              <w:bottom w:w="40.0" w:type="dxa"/>
-              <w:right w:w="40.0" w:type="dxa"/>
-            </w:tcMar>
-            <w:vAlign w:val="bottom"/>
-          </w:tcPr>
-          <w:p>
-            <w:pPr>
-              <w:widowControl w:val="0"/>
-              <w:jc w:val="center"/>
-              <w:rPr>
-                <w:sz w:val="20"/>
-                <w:szCs w:val="20"/>
-              </w:rPr>
-            </w:pPr>
-            <w:r>
-              <w:rPr>
-                <w:sz w:val="20"/>
-                <w:szCs w:val="20"/>
-                <w:rtl w:val="0"/>
-              </w:rPr>
-              <w:t xml:space="preserve">Could-Have</w:t>
+              <w:t xml:space="preserve">AI actions</w:t>
+            </w:r>
+          </w:p>
+        </w:tc>
+        <w:tc>
+          <w:tcPr>
+            <w:tcBorders>
+              <w:top w:color="cccccc" w:space="0" w:sz="6" w:val="single"/>
+              <w:left w:color="cccccc" w:space="0" w:sz="6" w:val="single"/>
+              <w:bottom w:color="cccccc" w:space="0" w:sz="6" w:val="single"/>
+              <w:right w:color="cccccc" w:space="0" w:sz="6" w:val="single"/>
+            </w:tcBorders>
+            <w:tcMar>
+              <w:top w:w="40.0" w:type="dxa"/>
+              <w:left w:w="40.0" w:type="dxa"/>
+              <w:bottom w:w="40.0" w:type="dxa"/>
+              <w:right w:w="40.0" w:type="dxa"/>
+            </w:tcMar>
+            <w:vAlign w:val="bottom"/>
+          </w:tcPr>
+          <w:p>
+            <w:pPr>
+              <w:widowControl w:val="0"/>
+              <w:jc w:val="center"/>
+              <w:rPr>
+                <w:sz w:val="20"/>
+                <w:szCs w:val="20"/>
+              </w:rPr>
+            </w:pPr>
+            <w:r>
+              <w:rPr>
+                <w:sz w:val="20"/>
+                <w:szCs w:val="20"/>
+                <w:rtl w:val="0"/>
+              </w:rPr>
+              <w:t xml:space="preserve">As a player I want my opponents to play realistically and well.</w:t>
+            </w:r>
+          </w:p>
+        </w:tc>
+        <w:tc>
+          <w:tcPr>
+            <w:tcBorders>
+              <w:top w:color="cccccc" w:space="0" w:sz="6" w:val="single"/>
+              <w:left w:color="cccccc" w:space="0" w:sz="6" w:val="single"/>
+              <w:bottom w:color="cccccc" w:space="0" w:sz="6" w:val="single"/>
+              <w:right w:color="cccccc" w:space="0" w:sz="6" w:val="single"/>
+            </w:tcBorders>
+            <w:tcMar>
+              <w:top w:w="40.0" w:type="dxa"/>
+              <w:left w:w="40.0" w:type="dxa"/>
+              <w:bottom w:w="40.0" w:type="dxa"/>
+              <w:right w:w="40.0" w:type="dxa"/>
+            </w:tcMar>
+            <w:vAlign w:val="bottom"/>
+          </w:tcPr>
+          <w:p>
+            <w:pPr>
+              <w:widowControl w:val="0"/>
+              <w:numPr>
+                <w:ilvl w:val="0"/>
+                <w:numId w:val="1"/>
+              </w:numPr>
+              <w:ind w:left="720" w:hanging="360"/>
+              <w:jc w:val="center"/>
+              <w:rPr>
+                <w:sz w:val="20"/>
+                <w:szCs w:val="20"/>
+                <w:u w:val="none"/>
+              </w:rPr>
+            </w:pPr>
+            <w:r>
+              <w:rPr>
+                <w:sz w:val="20"/>
+                <w:szCs w:val="20"/>
+                <w:rtl w:val="0"/>
+              </w:rPr>
+              <w:t xml:space="preserve">AI decision making for enemy players</w:t>
+            </w:r>
+          </w:p>
+        </w:tc>
+        <w:tc>
+          <w:tcPr>
+            <w:tcBorders>
+              <w:top w:color="cccccc" w:space="0" w:sz="6" w:val="single"/>
+              <w:left w:color="cccccc" w:space="0" w:sz="6" w:val="single"/>
+              <w:bottom w:color="cccccc" w:space="0" w:sz="6" w:val="single"/>
+              <w:right w:color="cccccc" w:space="0" w:sz="6" w:val="single"/>
+            </w:tcBorders>
+            <w:tcMar>
+              <w:top w:w="40.0" w:type="dxa"/>
+              <w:left w:w="40.0" w:type="dxa"/>
+              <w:bottom w:w="40.0" w:type="dxa"/>
+              <w:right w:w="40.0" w:type="dxa"/>
+            </w:tcMar>
+            <w:vAlign w:val="bottom"/>
+          </w:tcPr>
+          <w:p>
+            <w:pPr>
+              <w:widowControl w:val="0"/>
+              <w:jc w:val="center"/>
+              <w:rPr>
+                <w:sz w:val="20"/>
+                <w:szCs w:val="20"/>
+              </w:rPr>
+            </w:pPr>
+            <w:r>
+              <w:rPr>
+                <w:sz w:val="20"/>
+                <w:szCs w:val="20"/>
+                <w:rtl w:val="0"/>
+              </w:rPr>
+              <w:t xml:space="preserve">Must-Have</w:t>
             </w:r>
           </w:p>
         </w:tc>
@@ -3588,7 +3660,7 @@
                 <w:szCs w:val="20"/>
                 <w:rtl w:val="0"/>
               </w:rPr>
-              <w:t xml:space="preserve">Won't-Have</w:t>
+              <w:t xml:space="preserve">Could-Have</w:t>
             </w:r>
           </w:p>
         </w:tc>
@@ -3952,7 +4024,7 @@
                 <w:szCs w:val="20"/>
                 <w:rtl w:val="0"/>
               </w:rPr>
-              <w:t xml:space="preserve">Won't-Have</w:t>
+              <w:t xml:space="preserve">Could-Have</w:t>
             </w:r>
           </w:p>
         </w:tc>
@@ -4011,7 +4083,799 @@
 </file>
 
 <file path=word/numbering.xml><?xml version="1.0" encoding="utf-8"?>
-<w:numbering xmlns:mc="http://schemas.openxmlformats.org/markup-compatibility/2006" xmlns:o="urn:schemas-microsoft-com:office:office" xmlns:r="http://schemas.openxmlformats.org/officeDocument/2006/relationships" xmlns:m="http://schemas.openxmlformats.org/officeDocument/2006/math" xmlns:v="urn:schemas-microsoft-com:vml" xmlns:wp="http://schemas.openxmlformats.org/drawingml/2006/wordprocessingDrawing" xmlns:w10="urn:schemas-microsoft-com:office:word" xmlns:w="http://schemas.openxmlformats.org/wordprocessingml/2006/main" xmlns:wne="http://schemas.microsoft.com/office/word/2006/wordml" xmlns:sl="http://schemas.openxmlformats.org/schemaLibrary/2006/main" xmlns:a="http://schemas.openxmlformats.org/drawingml/2006/main" xmlns:pic="http://schemas.openxmlformats.org/drawingml/2006/picture" xmlns:c="http://schemas.openxmlformats.org/drawingml/2006/chart" xmlns:lc="http://schemas.openxmlformats.org/drawingml/2006/lockedCanvas" xmlns:dgm="http://schemas.openxmlformats.org/drawingml/2006/diagram" xmlns:wps="http://schemas.microsoft.com/office/word/2010/wordprocessingShape" xmlns:wpg="http://schemas.microsoft.com/office/word/2010/wordprocessingGroup" xmlns:w14="http://schemas.microsoft.com/office/word/2010/wordml" xmlns:w15="http://schemas.microsoft.com/office/word/2012/wordml" xmlns:w16="http://schemas.microsoft.com/office/word/2018/wordml" xmlns:w16cex="http://schemas.microsoft.com/office/word/2018/wordml/cex" xmlns:w16cid="http://schemas.microsoft.com/office/word/2016/wordml/cid" xmlns="http://schemas.microsoft.com/office/tasks/2019/documenttasks" xmlns:cr="http://schemas.microsoft.com/office/comments/2020/reactions"/>
+<w:numbering xmlns:mc="http://schemas.openxmlformats.org/markup-compatibility/2006" xmlns:o="urn:schemas-microsoft-com:office:office" xmlns:r="http://schemas.openxmlformats.org/officeDocument/2006/relationships" xmlns:m="http://schemas.openxmlformats.org/officeDocument/2006/math" xmlns:v="urn:schemas-microsoft-com:vml" xmlns:wp="http://schemas.openxmlformats.org/drawingml/2006/wordprocessingDrawing" xmlns:w10="urn:schemas-microsoft-com:office:word" xmlns:w="http://schemas.openxmlformats.org/wordprocessingml/2006/main" xmlns:wne="http://schemas.microsoft.com/office/word/2006/wordml" xmlns:sl="http://schemas.openxmlformats.org/schemaLibrary/2006/main" xmlns:a="http://schemas.openxmlformats.org/drawingml/2006/main" xmlns:pic="http://schemas.openxmlformats.org/drawingml/2006/picture" xmlns:c="http://schemas.openxmlformats.org/drawingml/2006/chart" xmlns:lc="http://schemas.openxmlformats.org/drawingml/2006/lockedCanvas" xmlns:dgm="http://schemas.openxmlformats.org/drawingml/2006/diagram" xmlns:wps="http://schemas.microsoft.com/office/word/2010/wordprocessingShape" xmlns:wpg="http://schemas.microsoft.com/office/word/2010/wordprocessingGroup" xmlns:w14="http://schemas.microsoft.com/office/word/2010/wordml" xmlns:w15="http://schemas.microsoft.com/office/word/2012/wordml" xmlns:w16="http://schemas.microsoft.com/office/word/2018/wordml" xmlns:w16cex="http://schemas.microsoft.com/office/word/2018/wordml/cex" xmlns:w16cid="http://schemas.microsoft.com/office/word/2016/wordml/cid" xmlns="http://schemas.microsoft.com/office/tasks/2019/documenttasks" xmlns:cr="http://schemas.microsoft.com/office/comments/2020/reactions">
+  <w:abstractNum w:abstractNumId="1">
+    <w:lvl w:ilvl="0">
+      <w:start w:val="1"/>
+      <w:numFmt w:val="decimal"/>
+      <w:lvlText w:val="%1."/>
+      <w:lvlJc w:val="left"/>
+      <w:pPr>
+        <w:ind w:left="720" w:hanging="360"/>
+      </w:pPr>
+      <w:rPr>
+        <w:u w:val="none"/>
+      </w:rPr>
+    </w:lvl>
+    <w:lvl w:ilvl="1">
+      <w:start w:val="1"/>
+      <w:numFmt w:val="lowerLetter"/>
+      <w:lvlText w:val="%2."/>
+      <w:lvlJc w:val="left"/>
+      <w:pPr>
+        <w:ind w:left="1440" w:hanging="360"/>
+      </w:pPr>
+      <w:rPr>
+        <w:u w:val="none"/>
+      </w:rPr>
+    </w:lvl>
+    <w:lvl w:ilvl="2">
+      <w:start w:val="1"/>
+      <w:numFmt w:val="lowerRoman"/>
+      <w:lvlText w:val="%3."/>
+      <w:lvlJc w:val="right"/>
+      <w:pPr>
+        <w:ind w:left="2160" w:hanging="360"/>
+      </w:pPr>
+      <w:rPr>
+        <w:u w:val="none"/>
+      </w:rPr>
+    </w:lvl>
+    <w:lvl w:ilvl="3">
+      <w:start w:val="1"/>
+      <w:numFmt w:val="decimal"/>
+      <w:lvlText w:val="%4."/>
+      <w:lvlJc w:val="left"/>
+      <w:pPr>
+        <w:ind w:left="2880" w:hanging="360"/>
+      </w:pPr>
+      <w:rPr>
+        <w:u w:val="none"/>
+      </w:rPr>
+    </w:lvl>
+    <w:lvl w:ilvl="4">
+      <w:start w:val="1"/>
+      <w:numFmt w:val="lowerLetter"/>
+      <w:lvlText w:val="%5."/>
+      <w:lvlJc w:val="left"/>
+      <w:pPr>
+        <w:ind w:left="3600" w:hanging="360"/>
+      </w:pPr>
+      <w:rPr>
+        <w:u w:val="none"/>
+      </w:rPr>
+    </w:lvl>
+    <w:lvl w:ilvl="5">
+      <w:start w:val="1"/>
+      <w:numFmt w:val="lowerRoman"/>
+      <w:lvlText w:val="%6."/>
+      <w:lvlJc w:val="right"/>
+      <w:pPr>
+        <w:ind w:left="4320" w:hanging="360"/>
+      </w:pPr>
+      <w:rPr>
+        <w:u w:val="none"/>
+      </w:rPr>
+    </w:lvl>
+    <w:lvl w:ilvl="6">
+      <w:start w:val="1"/>
+      <w:numFmt w:val="decimal"/>
+      <w:lvlText w:val="%7."/>
+      <w:lvlJc w:val="left"/>
+      <w:pPr>
+        <w:ind w:left="5040" w:hanging="360"/>
+      </w:pPr>
+      <w:rPr>
+        <w:u w:val="none"/>
+      </w:rPr>
+    </w:lvl>
+    <w:lvl w:ilvl="7">
+      <w:start w:val="1"/>
+      <w:numFmt w:val="lowerLetter"/>
+      <w:lvlText w:val="%8."/>
+      <w:lvlJc w:val="left"/>
+      <w:pPr>
+        <w:ind w:left="5760" w:hanging="360"/>
+      </w:pPr>
+      <w:rPr>
+        <w:u w:val="none"/>
+      </w:rPr>
+    </w:lvl>
+    <w:lvl w:ilvl="8">
+      <w:start w:val="1"/>
+      <w:numFmt w:val="lowerRoman"/>
+      <w:lvlText w:val="%9."/>
+      <w:lvlJc w:val="right"/>
+      <w:pPr>
+        <w:ind w:left="6480" w:hanging="360"/>
+      </w:pPr>
+      <w:rPr>
+        <w:u w:val="none"/>
+      </w:rPr>
+    </w:lvl>
+  </w:abstractNum>
+  <w:abstractNum w:abstractNumId="2">
+    <w:lvl w:ilvl="0">
+      <w:start w:val="1"/>
+      <w:numFmt w:val="decimal"/>
+      <w:lvlText w:val="%1."/>
+      <w:lvlJc w:val="left"/>
+      <w:pPr>
+        <w:ind w:left="720" w:hanging="360"/>
+      </w:pPr>
+      <w:rPr>
+        <w:u w:val="none"/>
+      </w:rPr>
+    </w:lvl>
+    <w:lvl w:ilvl="1">
+      <w:start w:val="1"/>
+      <w:numFmt w:val="lowerLetter"/>
+      <w:lvlText w:val="%2."/>
+      <w:lvlJc w:val="left"/>
+      <w:pPr>
+        <w:ind w:left="1440" w:hanging="360"/>
+      </w:pPr>
+      <w:rPr>
+        <w:u w:val="none"/>
+      </w:rPr>
+    </w:lvl>
+    <w:lvl w:ilvl="2">
+      <w:start w:val="1"/>
+      <w:numFmt w:val="lowerRoman"/>
+      <w:lvlText w:val="%3."/>
+      <w:lvlJc w:val="right"/>
+      <w:pPr>
+        <w:ind w:left="2160" w:hanging="360"/>
+      </w:pPr>
+      <w:rPr>
+        <w:u w:val="none"/>
+      </w:rPr>
+    </w:lvl>
+    <w:lvl w:ilvl="3">
+      <w:start w:val="1"/>
+      <w:numFmt w:val="decimal"/>
+      <w:lvlText w:val="%4."/>
+      <w:lvlJc w:val="left"/>
+      <w:pPr>
+        <w:ind w:left="2880" w:hanging="360"/>
+      </w:pPr>
+      <w:rPr>
+        <w:u w:val="none"/>
+      </w:rPr>
+    </w:lvl>
+    <w:lvl w:ilvl="4">
+      <w:start w:val="1"/>
+      <w:numFmt w:val="lowerLetter"/>
+      <w:lvlText w:val="%5."/>
+      <w:lvlJc w:val="left"/>
+      <w:pPr>
+        <w:ind w:left="3600" w:hanging="360"/>
+      </w:pPr>
+      <w:rPr>
+        <w:u w:val="none"/>
+      </w:rPr>
+    </w:lvl>
+    <w:lvl w:ilvl="5">
+      <w:start w:val="1"/>
+      <w:numFmt w:val="lowerRoman"/>
+      <w:lvlText w:val="%6."/>
+      <w:lvlJc w:val="right"/>
+      <w:pPr>
+        <w:ind w:left="4320" w:hanging="360"/>
+      </w:pPr>
+      <w:rPr>
+        <w:u w:val="none"/>
+      </w:rPr>
+    </w:lvl>
+    <w:lvl w:ilvl="6">
+      <w:start w:val="1"/>
+      <w:numFmt w:val="decimal"/>
+      <w:lvlText w:val="%7."/>
+      <w:lvlJc w:val="left"/>
+      <w:pPr>
+        <w:ind w:left="5040" w:hanging="360"/>
+      </w:pPr>
+      <w:rPr>
+        <w:u w:val="none"/>
+      </w:rPr>
+    </w:lvl>
+    <w:lvl w:ilvl="7">
+      <w:start w:val="1"/>
+      <w:numFmt w:val="lowerLetter"/>
+      <w:lvlText w:val="%8."/>
+      <w:lvlJc w:val="left"/>
+      <w:pPr>
+        <w:ind w:left="5760" w:hanging="360"/>
+      </w:pPr>
+      <w:rPr>
+        <w:u w:val="none"/>
+      </w:rPr>
+    </w:lvl>
+    <w:lvl w:ilvl="8">
+      <w:start w:val="1"/>
+      <w:numFmt w:val="lowerRoman"/>
+      <w:lvlText w:val="%9."/>
+      <w:lvlJc w:val="right"/>
+      <w:pPr>
+        <w:ind w:left="6480" w:hanging="360"/>
+      </w:pPr>
+      <w:rPr>
+        <w:u w:val="none"/>
+      </w:rPr>
+    </w:lvl>
+  </w:abstractNum>
+  <w:abstractNum w:abstractNumId="3">
+    <w:lvl w:ilvl="0">
+      <w:start w:val="1"/>
+      <w:numFmt w:val="decimal"/>
+      <w:lvlText w:val="%1."/>
+      <w:lvlJc w:val="left"/>
+      <w:pPr>
+        <w:ind w:left="1440" w:hanging="360"/>
+      </w:pPr>
+      <w:rPr>
+        <w:u w:val="none"/>
+      </w:rPr>
+    </w:lvl>
+    <w:lvl w:ilvl="1">
+      <w:start w:val="1"/>
+      <w:numFmt w:val="lowerLetter"/>
+      <w:lvlText w:val="%2."/>
+      <w:lvlJc w:val="left"/>
+      <w:pPr>
+        <w:ind w:left="2160" w:hanging="360"/>
+      </w:pPr>
+      <w:rPr>
+        <w:u w:val="none"/>
+      </w:rPr>
+    </w:lvl>
+    <w:lvl w:ilvl="2">
+      <w:start w:val="1"/>
+      <w:numFmt w:val="lowerRoman"/>
+      <w:lvlText w:val="%3."/>
+      <w:lvlJc w:val="right"/>
+      <w:pPr>
+        <w:ind w:left="2880" w:hanging="360"/>
+      </w:pPr>
+      <w:rPr>
+        <w:u w:val="none"/>
+      </w:rPr>
+    </w:lvl>
+    <w:lvl w:ilvl="3">
+      <w:start w:val="1"/>
+      <w:numFmt w:val="decimal"/>
+      <w:lvlText w:val="%4."/>
+      <w:lvlJc w:val="left"/>
+      <w:pPr>
+        <w:ind w:left="3600" w:hanging="360"/>
+      </w:pPr>
+      <w:rPr>
+        <w:u w:val="none"/>
+      </w:rPr>
+    </w:lvl>
+    <w:lvl w:ilvl="4">
+      <w:start w:val="1"/>
+      <w:numFmt w:val="lowerLetter"/>
+      <w:lvlText w:val="%5."/>
+      <w:lvlJc w:val="left"/>
+      <w:pPr>
+        <w:ind w:left="4320" w:hanging="360"/>
+      </w:pPr>
+      <w:rPr>
+        <w:u w:val="none"/>
+      </w:rPr>
+    </w:lvl>
+    <w:lvl w:ilvl="5">
+      <w:start w:val="1"/>
+      <w:numFmt w:val="lowerRoman"/>
+      <w:lvlText w:val="%6."/>
+      <w:lvlJc w:val="right"/>
+      <w:pPr>
+        <w:ind w:left="5040" w:hanging="360"/>
+      </w:pPr>
+      <w:rPr>
+        <w:u w:val="none"/>
+      </w:rPr>
+    </w:lvl>
+    <w:lvl w:ilvl="6">
+      <w:start w:val="1"/>
+      <w:numFmt w:val="decimal"/>
+      <w:lvlText w:val="%7."/>
+      <w:lvlJc w:val="left"/>
+      <w:pPr>
+        <w:ind w:left="5760" w:hanging="360"/>
+      </w:pPr>
+      <w:rPr>
+        <w:u w:val="none"/>
+      </w:rPr>
+    </w:lvl>
+    <w:lvl w:ilvl="7">
+      <w:start w:val="1"/>
+      <w:numFmt w:val="lowerLetter"/>
+      <w:lvlText w:val="%8."/>
+      <w:lvlJc w:val="left"/>
+      <w:pPr>
+        <w:ind w:left="6480" w:hanging="360"/>
+      </w:pPr>
+      <w:rPr>
+        <w:u w:val="none"/>
+      </w:rPr>
+    </w:lvl>
+    <w:lvl w:ilvl="8">
+      <w:start w:val="1"/>
+      <w:numFmt w:val="lowerRoman"/>
+      <w:lvlText w:val="%9."/>
+      <w:lvlJc w:val="right"/>
+      <w:pPr>
+        <w:ind w:left="7200" w:hanging="360"/>
+      </w:pPr>
+      <w:rPr>
+        <w:u w:val="none"/>
+      </w:rPr>
+    </w:lvl>
+  </w:abstractNum>
+  <w:abstractNum w:abstractNumId="4">
+    <w:lvl w:ilvl="0">
+      <w:start w:val="1"/>
+      <w:numFmt w:val="decimal"/>
+      <w:lvlText w:val="%1."/>
+      <w:lvlJc w:val="left"/>
+      <w:pPr>
+        <w:ind w:left="720" w:hanging="360"/>
+      </w:pPr>
+      <w:rPr>
+        <w:u w:val="none"/>
+      </w:rPr>
+    </w:lvl>
+    <w:lvl w:ilvl="1">
+      <w:start w:val="1"/>
+      <w:numFmt w:val="lowerLetter"/>
+      <w:lvlText w:val="%2."/>
+      <w:lvlJc w:val="left"/>
+      <w:pPr>
+        <w:ind w:left="1440" w:hanging="360"/>
+      </w:pPr>
+      <w:rPr>
+        <w:u w:val="none"/>
+      </w:rPr>
+    </w:lvl>
+    <w:lvl w:ilvl="2">
+      <w:start w:val="1"/>
+      <w:numFmt w:val="lowerRoman"/>
+      <w:lvlText w:val="%3."/>
+      <w:lvlJc w:val="right"/>
+      <w:pPr>
+        <w:ind w:left="2160" w:hanging="360"/>
+      </w:pPr>
+      <w:rPr>
+        <w:u w:val="none"/>
+      </w:rPr>
+    </w:lvl>
+    <w:lvl w:ilvl="3">
+      <w:start w:val="1"/>
+      <w:numFmt w:val="decimal"/>
+      <w:lvlText w:val="%4."/>
+      <w:lvlJc w:val="left"/>
+      <w:pPr>
+        <w:ind w:left="2880" w:hanging="360"/>
+      </w:pPr>
+      <w:rPr>
+        <w:u w:val="none"/>
+      </w:rPr>
+    </w:lvl>
+    <w:lvl w:ilvl="4">
+      <w:start w:val="1"/>
+      <w:numFmt w:val="lowerLetter"/>
+      <w:lvlText w:val="%5."/>
+      <w:lvlJc w:val="left"/>
+      <w:pPr>
+        <w:ind w:left="3600" w:hanging="360"/>
+      </w:pPr>
+      <w:rPr>
+        <w:u w:val="none"/>
+      </w:rPr>
+    </w:lvl>
+    <w:lvl w:ilvl="5">
+      <w:start w:val="1"/>
+      <w:numFmt w:val="lowerRoman"/>
+      <w:lvlText w:val="%6."/>
+      <w:lvlJc w:val="right"/>
+      <w:pPr>
+        <w:ind w:left="4320" w:hanging="360"/>
+      </w:pPr>
+      <w:rPr>
+        <w:u w:val="none"/>
+      </w:rPr>
+    </w:lvl>
+    <w:lvl w:ilvl="6">
+      <w:start w:val="1"/>
+      <w:numFmt w:val="decimal"/>
+      <w:lvlText w:val="%7."/>
+      <w:lvlJc w:val="left"/>
+      <w:pPr>
+        <w:ind w:left="5040" w:hanging="360"/>
+      </w:pPr>
+      <w:rPr>
+        <w:u w:val="none"/>
+      </w:rPr>
+    </w:lvl>
+    <w:lvl w:ilvl="7">
+      <w:start w:val="1"/>
+      <w:numFmt w:val="lowerLetter"/>
+      <w:lvlText w:val="%8."/>
+      <w:lvlJc w:val="left"/>
+      <w:pPr>
+        <w:ind w:left="5760" w:hanging="360"/>
+      </w:pPr>
+      <w:rPr>
+        <w:u w:val="none"/>
+      </w:rPr>
+    </w:lvl>
+    <w:lvl w:ilvl="8">
+      <w:start w:val="1"/>
+      <w:numFmt w:val="lowerRoman"/>
+      <w:lvlText w:val="%9."/>
+      <w:lvlJc w:val="right"/>
+      <w:pPr>
+        <w:ind w:left="6480" w:hanging="360"/>
+      </w:pPr>
+      <w:rPr>
+        <w:u w:val="none"/>
+      </w:rPr>
+    </w:lvl>
+  </w:abstractNum>
+  <w:abstractNum w:abstractNumId="5">
+    <w:lvl w:ilvl="0">
+      <w:start w:val="1"/>
+      <w:numFmt w:val="decimal"/>
+      <w:lvlText w:val="%1."/>
+      <w:lvlJc w:val="left"/>
+      <w:pPr>
+        <w:ind w:left="720" w:hanging="360"/>
+      </w:pPr>
+      <w:rPr>
+        <w:u w:val="none"/>
+      </w:rPr>
+    </w:lvl>
+    <w:lvl w:ilvl="1">
+      <w:start w:val="1"/>
+      <w:numFmt w:val="lowerLetter"/>
+      <w:lvlText w:val="%2."/>
+      <w:lvlJc w:val="left"/>
+      <w:pPr>
+        <w:ind w:left="1440" w:hanging="360"/>
+      </w:pPr>
+      <w:rPr>
+        <w:u w:val="none"/>
+      </w:rPr>
+    </w:lvl>
+    <w:lvl w:ilvl="2">
+      <w:start w:val="1"/>
+      <w:numFmt w:val="lowerRoman"/>
+      <w:lvlText w:val="%3."/>
+      <w:lvlJc w:val="right"/>
+      <w:pPr>
+        <w:ind w:left="2160" w:hanging="360"/>
+      </w:pPr>
+      <w:rPr>
+        <w:u w:val="none"/>
+      </w:rPr>
+    </w:lvl>
+    <w:lvl w:ilvl="3">
+      <w:start w:val="1"/>
+      <w:numFmt w:val="decimal"/>
+      <w:lvlText w:val="%4."/>
+      <w:lvlJc w:val="left"/>
+      <w:pPr>
+        <w:ind w:left="2880" w:hanging="360"/>
+      </w:pPr>
+      <w:rPr>
+        <w:u w:val="none"/>
+      </w:rPr>
+    </w:lvl>
+    <w:lvl w:ilvl="4">
+      <w:start w:val="1"/>
+      <w:numFmt w:val="lowerLetter"/>
+      <w:lvlText w:val="%5."/>
+      <w:lvlJc w:val="left"/>
+      <w:pPr>
+        <w:ind w:left="3600" w:hanging="360"/>
+      </w:pPr>
+      <w:rPr>
+        <w:u w:val="none"/>
+      </w:rPr>
+    </w:lvl>
+    <w:lvl w:ilvl="5">
+      <w:start w:val="1"/>
+      <w:numFmt w:val="lowerRoman"/>
+      <w:lvlText w:val="%6."/>
+      <w:lvlJc w:val="right"/>
+      <w:pPr>
+        <w:ind w:left="4320" w:hanging="360"/>
+      </w:pPr>
+      <w:rPr>
+        <w:u w:val="none"/>
+      </w:rPr>
+    </w:lvl>
+    <w:lvl w:ilvl="6">
+      <w:start w:val="1"/>
+      <w:numFmt w:val="decimal"/>
+      <w:lvlText w:val="%7."/>
+      <w:lvlJc w:val="left"/>
+      <w:pPr>
+        <w:ind w:left="5040" w:hanging="360"/>
+      </w:pPr>
+      <w:rPr>
+        <w:u w:val="none"/>
+      </w:rPr>
+    </w:lvl>
+    <w:lvl w:ilvl="7">
+      <w:start w:val="1"/>
+      <w:numFmt w:val="lowerLetter"/>
+      <w:lvlText w:val="%8."/>
+      <w:lvlJc w:val="left"/>
+      <w:pPr>
+        <w:ind w:left="5760" w:hanging="360"/>
+      </w:pPr>
+      <w:rPr>
+        <w:u w:val="none"/>
+      </w:rPr>
+    </w:lvl>
+    <w:lvl w:ilvl="8">
+      <w:start w:val="1"/>
+      <w:numFmt w:val="lowerRoman"/>
+      <w:lvlText w:val="%9."/>
+      <w:lvlJc w:val="right"/>
+      <w:pPr>
+        <w:ind w:left="6480" w:hanging="360"/>
+      </w:pPr>
+      <w:rPr>
+        <w:u w:val="none"/>
+      </w:rPr>
+    </w:lvl>
+  </w:abstractNum>
+  <w:abstractNum w:abstractNumId="6">
+    <w:lvl w:ilvl="0">
+      <w:start w:val="1"/>
+      <w:numFmt w:val="decimal"/>
+      <w:lvlText w:val="%1."/>
+      <w:lvlJc w:val="left"/>
+      <w:pPr>
+        <w:ind w:left="720" w:hanging="360"/>
+      </w:pPr>
+      <w:rPr>
+        <w:u w:val="none"/>
+      </w:rPr>
+    </w:lvl>
+    <w:lvl w:ilvl="1">
+      <w:start w:val="1"/>
+      <w:numFmt w:val="lowerLetter"/>
+      <w:lvlText w:val="%2."/>
+      <w:lvlJc w:val="left"/>
+      <w:pPr>
+        <w:ind w:left="1440" w:hanging="360"/>
+      </w:pPr>
+      <w:rPr>
+        <w:u w:val="none"/>
+      </w:rPr>
+    </w:lvl>
+    <w:lvl w:ilvl="2">
+      <w:start w:val="1"/>
+      <w:numFmt w:val="lowerRoman"/>
+      <w:lvlText w:val="%3."/>
+      <w:lvlJc w:val="right"/>
+      <w:pPr>
+        <w:ind w:left="2160" w:hanging="360"/>
+      </w:pPr>
+      <w:rPr>
+        <w:u w:val="none"/>
+      </w:rPr>
+    </w:lvl>
+    <w:lvl w:ilvl="3">
+      <w:start w:val="1"/>
+      <w:numFmt w:val="decimal"/>
+      <w:lvlText w:val="%4."/>
+      <w:lvlJc w:val="left"/>
+      <w:pPr>
+        <w:ind w:left="2880" w:hanging="360"/>
+      </w:pPr>
+      <w:rPr>
+        <w:u w:val="none"/>
+      </w:rPr>
+    </w:lvl>
+    <w:lvl w:ilvl="4">
+      <w:start w:val="1"/>
+      <w:numFmt w:val="lowerLetter"/>
+      <w:lvlText w:val="%5."/>
+      <w:lvlJc w:val="left"/>
+      <w:pPr>
+        <w:ind w:left="3600" w:hanging="360"/>
+      </w:pPr>
+      <w:rPr>
+        <w:u w:val="none"/>
+      </w:rPr>
+    </w:lvl>
+    <w:lvl w:ilvl="5">
+      <w:start w:val="1"/>
+      <w:numFmt w:val="lowerRoman"/>
+      <w:lvlText w:val="%6."/>
+      <w:lvlJc w:val="right"/>
+      <w:pPr>
+        <w:ind w:left="4320" w:hanging="360"/>
+      </w:pPr>
+      <w:rPr>
+        <w:u w:val="none"/>
+      </w:rPr>
+    </w:lvl>
+    <w:lvl w:ilvl="6">
+      <w:start w:val="1"/>
+      <w:numFmt w:val="decimal"/>
+      <w:lvlText w:val="%7."/>
+      <w:lvlJc w:val="left"/>
+      <w:pPr>
+        <w:ind w:left="5040" w:hanging="360"/>
+      </w:pPr>
+      <w:rPr>
+        <w:u w:val="none"/>
+      </w:rPr>
+    </w:lvl>
+    <w:lvl w:ilvl="7">
+      <w:start w:val="1"/>
+      <w:numFmt w:val="lowerLetter"/>
+      <w:lvlText w:val="%8."/>
+      <w:lvlJc w:val="left"/>
+      <w:pPr>
+        <w:ind w:left="5760" w:hanging="360"/>
+      </w:pPr>
+      <w:rPr>
+        <w:u w:val="none"/>
+      </w:rPr>
+    </w:lvl>
+    <w:lvl w:ilvl="8">
+      <w:start w:val="1"/>
+      <w:numFmt w:val="lowerRoman"/>
+      <w:lvlText w:val="%9."/>
+      <w:lvlJc w:val="right"/>
+      <w:pPr>
+        <w:ind w:left="6480" w:hanging="360"/>
+      </w:pPr>
+      <w:rPr>
+        <w:u w:val="none"/>
+      </w:rPr>
+    </w:lvl>
+  </w:abstractNum>
+  <w:abstractNum w:abstractNumId="7">
+    <w:lvl w:ilvl="0">
+      <w:start w:val="1"/>
+      <w:numFmt w:val="decimal"/>
+      <w:lvlText w:val="%1."/>
+      <w:lvlJc w:val="left"/>
+      <w:pPr>
+        <w:ind w:left="720" w:hanging="360"/>
+      </w:pPr>
+      <w:rPr>
+        <w:u w:val="none"/>
+      </w:rPr>
+    </w:lvl>
+    <w:lvl w:ilvl="1">
+      <w:start w:val="1"/>
+      <w:numFmt w:val="lowerLetter"/>
+      <w:lvlText w:val="%2."/>
+      <w:lvlJc w:val="left"/>
+      <w:pPr>
+        <w:ind w:left="1440" w:hanging="360"/>
+      </w:pPr>
+      <w:rPr>
+        <w:u w:val="none"/>
+      </w:rPr>
+    </w:lvl>
+    <w:lvl w:ilvl="2">
+      <w:start w:val="1"/>
+      <w:numFmt w:val="lowerRoman"/>
+      <w:lvlText w:val="%3."/>
+      <w:lvlJc w:val="right"/>
+      <w:pPr>
+        <w:ind w:left="2160" w:hanging="360"/>
+      </w:pPr>
+      <w:rPr>
+        <w:u w:val="none"/>
+      </w:rPr>
+    </w:lvl>
+    <w:lvl w:ilvl="3">
+      <w:start w:val="1"/>
+      <w:numFmt w:val="decimal"/>
+      <w:lvlText w:val="%4."/>
+      <w:lvlJc w:val="left"/>
+      <w:pPr>
+        <w:ind w:left="2880" w:hanging="360"/>
+      </w:pPr>
+      <w:rPr>
+        <w:u w:val="none"/>
+      </w:rPr>
+    </w:lvl>
+    <w:lvl w:ilvl="4">
+      <w:start w:val="1"/>
+      <w:numFmt w:val="lowerLetter"/>
+      <w:lvlText w:val="%5."/>
+      <w:lvlJc w:val="left"/>
+      <w:pPr>
+        <w:ind w:left="3600" w:hanging="360"/>
+      </w:pPr>
+      <w:rPr>
+        <w:u w:val="none"/>
+      </w:rPr>
+    </w:lvl>
+    <w:lvl w:ilvl="5">
+      <w:start w:val="1"/>
+      <w:numFmt w:val="lowerRoman"/>
+      <w:lvlText w:val="%6."/>
+      <w:lvlJc w:val="right"/>
+      <w:pPr>
+        <w:ind w:left="4320" w:hanging="360"/>
+      </w:pPr>
+      <w:rPr>
+        <w:u w:val="none"/>
+      </w:rPr>
+    </w:lvl>
+    <w:lvl w:ilvl="6">
+      <w:start w:val="1"/>
+      <w:numFmt w:val="decimal"/>
+      <w:lvlText w:val="%7."/>
+      <w:lvlJc w:val="left"/>
+      <w:pPr>
+        <w:ind w:left="5040" w:hanging="360"/>
+      </w:pPr>
+      <w:rPr>
+        <w:u w:val="none"/>
+      </w:rPr>
+    </w:lvl>
+    <w:lvl w:ilvl="7">
+      <w:start w:val="1"/>
+      <w:numFmt w:val="lowerLetter"/>
+      <w:lvlText w:val="%8."/>
+      <w:lvlJc w:val="left"/>
+      <w:pPr>
+        <w:ind w:left="5760" w:hanging="360"/>
+      </w:pPr>
+      <w:rPr>
+        <w:u w:val="none"/>
+      </w:rPr>
+    </w:lvl>
+    <w:lvl w:ilvl="8">
+      <w:start w:val="1"/>
+      <w:numFmt w:val="lowerRoman"/>
+      <w:lvlText w:val="%9."/>
+      <w:lvlJc w:val="right"/>
+      <w:pPr>
+        <w:ind w:left="6480" w:hanging="360"/>
+      </w:pPr>
+      <w:rPr>
+        <w:u w:val="none"/>
+      </w:rPr>
+    </w:lvl>
+  </w:abstractNum>
+  <w:num w:numId="1">
+    <w:abstractNumId w:val="1"/>
+  </w:num>
+  <w:num w:numId="2">
+    <w:abstractNumId w:val="2"/>
+  </w:num>
+  <w:num w:numId="3">
+    <w:abstractNumId w:val="3"/>
+  </w:num>
+  <w:num w:numId="4">
+    <w:abstractNumId w:val="4"/>
+  </w:num>
+  <w:num w:numId="5">
+    <w:abstractNumId w:val="5"/>
+  </w:num>
+  <w:num w:numId="6">
+    <w:abstractNumId w:val="6"/>
+  </w:num>
+  <w:num w:numId="7">
+    <w:abstractNumId w:val="7"/>
+  </w:num>
+</w:numbering>
 </file>
 
 <file path=word/styles.xml><?xml version="1.0" encoding="utf-8"?>

</xml_diff>

<commit_message>
Updated CI and documentation for User stories and User feedback files
</commit_message>
<xml_diff>
--- a/Documents/User Stories v2.docx
+++ b/Documents/User Stories v2.docx
@@ -16,8 +16,9 @@
     <w:tbl>
       <w:tblPr>
         <w:tblStyle w:val="Table1"/>
-        <w:tblW w:w="14385.0" w:type="dxa"/>
+        <w:tblW w:w="16020.0" w:type="dxa"/>
         <w:jc w:val="left"/>
+        <w:tblInd w:w="-1080.0" w:type="dxa"/>
         <w:tblBorders>
           <w:top w:color="000000" w:space="0" w:sz="0" w:val="nil"/>
           <w:left w:color="000000" w:space="0" w:sz="0" w:val="nil"/>
@@ -30,18 +31,22 @@
         <w:tblLook w:val="0600"/>
       </w:tblPr>
       <w:tblGrid>
-        <w:gridCol w:w="1500"/>
-        <w:gridCol w:w="1500"/>
-        <w:gridCol w:w="5085"/>
-        <w:gridCol w:w="4425"/>
-        <w:gridCol w:w="1875"/>
+        <w:gridCol w:w="1065"/>
+        <w:gridCol w:w="1380"/>
+        <w:gridCol w:w="3240"/>
+        <w:gridCol w:w="2910"/>
+        <w:gridCol w:w="2220"/>
+        <w:gridCol w:w="1710"/>
+        <w:gridCol w:w="3495"/>
         <w:tblGridChange w:id="0">
           <w:tblGrid>
-            <w:gridCol w:w="1500"/>
-            <w:gridCol w:w="1500"/>
-            <w:gridCol w:w="5085"/>
-            <w:gridCol w:w="4425"/>
-            <w:gridCol w:w="1875"/>
+            <w:gridCol w:w="1065"/>
+            <w:gridCol w:w="1380"/>
+            <w:gridCol w:w="3240"/>
+            <w:gridCol w:w="2910"/>
+            <w:gridCol w:w="2220"/>
+            <w:gridCol w:w="1710"/>
+            <w:gridCol w:w="3495"/>
           </w:tblGrid>
         </w:tblGridChange>
       </w:tblGrid>
@@ -226,6 +231,76 @@
             </w:r>
           </w:p>
         </w:tc>
+        <w:tc>
+          <w:tcPr>
+            <w:tcBorders>
+              <w:top w:color="cccccc" w:space="0" w:sz="6" w:val="single"/>
+              <w:left w:color="cccccc" w:space="0" w:sz="6" w:val="single"/>
+              <w:bottom w:color="cccccc" w:space="0" w:sz="6" w:val="single"/>
+              <w:right w:color="cccccc" w:space="0" w:sz="6" w:val="single"/>
+            </w:tcBorders>
+            <w:tcMar>
+              <w:top w:w="40.0" w:type="dxa"/>
+              <w:left w:w="40.0" w:type="dxa"/>
+              <w:bottom w:w="40.0" w:type="dxa"/>
+              <w:right w:w="40.0" w:type="dxa"/>
+            </w:tcMar>
+            <w:vAlign w:val="bottom"/>
+          </w:tcPr>
+          <w:p>
+            <w:pPr>
+              <w:widowControl w:val="0"/>
+              <w:jc w:val="center"/>
+              <w:rPr>
+                <w:sz w:val="20"/>
+                <w:szCs w:val="20"/>
+              </w:rPr>
+            </w:pPr>
+            <w:r>
+              <w:rPr>
+                <w:sz w:val="20"/>
+                <w:szCs w:val="20"/>
+                <w:rtl w:val="0"/>
+              </w:rPr>
+              <w:t xml:space="preserve">Status</w:t>
+            </w:r>
+          </w:p>
+        </w:tc>
+        <w:tc>
+          <w:tcPr>
+            <w:tcBorders>
+              <w:top w:color="cccccc" w:space="0" w:sz="6" w:val="single"/>
+              <w:left w:color="cccccc" w:space="0" w:sz="6" w:val="single"/>
+              <w:bottom w:color="cccccc" w:space="0" w:sz="6" w:val="single"/>
+              <w:right w:color="cccccc" w:space="0" w:sz="6" w:val="single"/>
+            </w:tcBorders>
+            <w:tcMar>
+              <w:top w:w="40.0" w:type="dxa"/>
+              <w:left w:w="40.0" w:type="dxa"/>
+              <w:bottom w:w="40.0" w:type="dxa"/>
+              <w:right w:w="40.0" w:type="dxa"/>
+            </w:tcMar>
+            <w:vAlign w:val="bottom"/>
+          </w:tcPr>
+          <w:p>
+            <w:pPr>
+              <w:widowControl w:val="0"/>
+              <w:jc w:val="center"/>
+              <w:rPr>
+                <w:sz w:val="20"/>
+                <w:szCs w:val="20"/>
+              </w:rPr>
+            </w:pPr>
+            <w:r>
+              <w:rPr>
+                <w:sz w:val="20"/>
+                <w:szCs w:val="20"/>
+                <w:rtl w:val="0"/>
+              </w:rPr>
+              <w:t xml:space="preserve">Story Points</w:t>
+            </w:r>
+          </w:p>
+        </w:tc>
       </w:tr>
       <w:tr>
         <w:trPr>
@@ -426,6 +501,76 @@
             </w:r>
           </w:p>
         </w:tc>
+        <w:tc>
+          <w:tcPr>
+            <w:tcBorders>
+              <w:top w:color="cccccc" w:space="0" w:sz="6" w:val="single"/>
+              <w:left w:color="cccccc" w:space="0" w:sz="6" w:val="single"/>
+              <w:bottom w:color="cccccc" w:space="0" w:sz="6" w:val="single"/>
+              <w:right w:color="cccccc" w:space="0" w:sz="6" w:val="single"/>
+            </w:tcBorders>
+            <w:tcMar>
+              <w:top w:w="40.0" w:type="dxa"/>
+              <w:left w:w="40.0" w:type="dxa"/>
+              <w:bottom w:w="40.0" w:type="dxa"/>
+              <w:right w:w="40.0" w:type="dxa"/>
+            </w:tcMar>
+            <w:vAlign w:val="bottom"/>
+          </w:tcPr>
+          <w:p>
+            <w:pPr>
+              <w:widowControl w:val="0"/>
+              <w:jc w:val="center"/>
+              <w:rPr>
+                <w:sz w:val="20"/>
+                <w:szCs w:val="20"/>
+              </w:rPr>
+            </w:pPr>
+            <w:r>
+              <w:rPr>
+                <w:sz w:val="20"/>
+                <w:szCs w:val="20"/>
+                <w:rtl w:val="0"/>
+              </w:rPr>
+              <w:t xml:space="preserve">Done</w:t>
+            </w:r>
+          </w:p>
+        </w:tc>
+        <w:tc>
+          <w:tcPr>
+            <w:tcBorders>
+              <w:top w:color="cccccc" w:space="0" w:sz="6" w:val="single"/>
+              <w:left w:color="cccccc" w:space="0" w:sz="6" w:val="single"/>
+              <w:bottom w:color="cccccc" w:space="0" w:sz="6" w:val="single"/>
+              <w:right w:color="cccccc" w:space="0" w:sz="6" w:val="single"/>
+            </w:tcBorders>
+            <w:tcMar>
+              <w:top w:w="40.0" w:type="dxa"/>
+              <w:left w:w="40.0" w:type="dxa"/>
+              <w:bottom w:w="40.0" w:type="dxa"/>
+              <w:right w:w="40.0" w:type="dxa"/>
+            </w:tcMar>
+            <w:vAlign w:val="bottom"/>
+          </w:tcPr>
+          <w:p>
+            <w:pPr>
+              <w:widowControl w:val="0"/>
+              <w:jc w:val="center"/>
+              <w:rPr>
+                <w:sz w:val="20"/>
+                <w:szCs w:val="20"/>
+              </w:rPr>
+            </w:pPr>
+            <w:r>
+              <w:rPr>
+                <w:sz w:val="20"/>
+                <w:szCs w:val="20"/>
+                <w:rtl w:val="0"/>
+              </w:rPr>
+              <w:t xml:space="preserve">15</w:t>
+            </w:r>
+          </w:p>
+        </w:tc>
       </w:tr>
       <w:tr>
         <w:trPr>
@@ -626,6 +771,76 @@
             </w:r>
           </w:p>
         </w:tc>
+        <w:tc>
+          <w:tcPr>
+            <w:tcBorders>
+              <w:top w:color="cccccc" w:space="0" w:sz="6" w:val="single"/>
+              <w:left w:color="cccccc" w:space="0" w:sz="6" w:val="single"/>
+              <w:bottom w:color="cccccc" w:space="0" w:sz="6" w:val="single"/>
+              <w:right w:color="cccccc" w:space="0" w:sz="6" w:val="single"/>
+            </w:tcBorders>
+            <w:tcMar>
+              <w:top w:w="40.0" w:type="dxa"/>
+              <w:left w:w="40.0" w:type="dxa"/>
+              <w:bottom w:w="40.0" w:type="dxa"/>
+              <w:right w:w="40.0" w:type="dxa"/>
+            </w:tcMar>
+            <w:vAlign w:val="bottom"/>
+          </w:tcPr>
+          <w:p>
+            <w:pPr>
+              <w:widowControl w:val="0"/>
+              <w:jc w:val="center"/>
+              <w:rPr>
+                <w:sz w:val="20"/>
+                <w:szCs w:val="20"/>
+              </w:rPr>
+            </w:pPr>
+            <w:r>
+              <w:rPr>
+                <w:sz w:val="20"/>
+                <w:szCs w:val="20"/>
+                <w:rtl w:val="0"/>
+              </w:rPr>
+              <w:t xml:space="preserve">Done</w:t>
+            </w:r>
+          </w:p>
+        </w:tc>
+        <w:tc>
+          <w:tcPr>
+            <w:tcBorders>
+              <w:top w:color="cccccc" w:space="0" w:sz="6" w:val="single"/>
+              <w:left w:color="cccccc" w:space="0" w:sz="6" w:val="single"/>
+              <w:bottom w:color="cccccc" w:space="0" w:sz="6" w:val="single"/>
+              <w:right w:color="cccccc" w:space="0" w:sz="6" w:val="single"/>
+            </w:tcBorders>
+            <w:tcMar>
+              <w:top w:w="40.0" w:type="dxa"/>
+              <w:left w:w="40.0" w:type="dxa"/>
+              <w:bottom w:w="40.0" w:type="dxa"/>
+              <w:right w:w="40.0" w:type="dxa"/>
+            </w:tcMar>
+            <w:vAlign w:val="bottom"/>
+          </w:tcPr>
+          <w:p>
+            <w:pPr>
+              <w:widowControl w:val="0"/>
+              <w:jc w:val="center"/>
+              <w:rPr>
+                <w:sz w:val="20"/>
+                <w:szCs w:val="20"/>
+              </w:rPr>
+            </w:pPr>
+            <w:r>
+              <w:rPr>
+                <w:sz w:val="20"/>
+                <w:szCs w:val="20"/>
+                <w:rtl w:val="0"/>
+              </w:rPr>
+              <w:t xml:space="preserve">10</w:t>
+            </w:r>
+          </w:p>
+        </w:tc>
       </w:tr>
       <w:tr>
         <w:trPr>
@@ -759,7 +974,7 @@
               <w:widowControl w:val="0"/>
               <w:numPr>
                 <w:ilvl w:val="0"/>
-                <w:numId w:val="3"/>
+                <w:numId w:val="4"/>
               </w:numPr>
               <w:ind w:left="1440" w:hanging="360"/>
               <w:jc w:val="center"/>
@@ -811,6 +1026,76 @@
                 <w:rtl w:val="0"/>
               </w:rPr>
               <w:t xml:space="preserve">Must-Have</w:t>
+            </w:r>
+          </w:p>
+        </w:tc>
+        <w:tc>
+          <w:tcPr>
+            <w:tcBorders>
+              <w:top w:color="cccccc" w:space="0" w:sz="6" w:val="single"/>
+              <w:left w:color="cccccc" w:space="0" w:sz="6" w:val="single"/>
+              <w:bottom w:color="cccccc" w:space="0" w:sz="6" w:val="single"/>
+              <w:right w:color="cccccc" w:space="0" w:sz="6" w:val="single"/>
+            </w:tcBorders>
+            <w:tcMar>
+              <w:top w:w="40.0" w:type="dxa"/>
+              <w:left w:w="40.0" w:type="dxa"/>
+              <w:bottom w:w="40.0" w:type="dxa"/>
+              <w:right w:w="40.0" w:type="dxa"/>
+            </w:tcMar>
+            <w:vAlign w:val="bottom"/>
+          </w:tcPr>
+          <w:p>
+            <w:pPr>
+              <w:widowControl w:val="0"/>
+              <w:jc w:val="center"/>
+              <w:rPr>
+                <w:sz w:val="20"/>
+                <w:szCs w:val="20"/>
+              </w:rPr>
+            </w:pPr>
+            <w:r>
+              <w:rPr>
+                <w:sz w:val="20"/>
+                <w:szCs w:val="20"/>
+                <w:rtl w:val="0"/>
+              </w:rPr>
+              <w:t xml:space="preserve">Done</w:t>
+            </w:r>
+          </w:p>
+        </w:tc>
+        <w:tc>
+          <w:tcPr>
+            <w:tcBorders>
+              <w:top w:color="cccccc" w:space="0" w:sz="6" w:val="single"/>
+              <w:left w:color="cccccc" w:space="0" w:sz="6" w:val="single"/>
+              <w:bottom w:color="cccccc" w:space="0" w:sz="6" w:val="single"/>
+              <w:right w:color="cccccc" w:space="0" w:sz="6" w:val="single"/>
+            </w:tcBorders>
+            <w:tcMar>
+              <w:top w:w="40.0" w:type="dxa"/>
+              <w:left w:w="40.0" w:type="dxa"/>
+              <w:bottom w:w="40.0" w:type="dxa"/>
+              <w:right w:w="40.0" w:type="dxa"/>
+            </w:tcMar>
+            <w:vAlign w:val="bottom"/>
+          </w:tcPr>
+          <w:p>
+            <w:pPr>
+              <w:widowControl w:val="0"/>
+              <w:jc w:val="center"/>
+              <w:rPr>
+                <w:sz w:val="20"/>
+                <w:szCs w:val="20"/>
+              </w:rPr>
+            </w:pPr>
+            <w:r>
+              <w:rPr>
+                <w:sz w:val="20"/>
+                <w:szCs w:val="20"/>
+                <w:rtl w:val="0"/>
+              </w:rPr>
+              <w:t xml:space="preserve">4</w:t>
             </w:r>
           </w:p>
         </w:tc>
@@ -1014,6 +1299,76 @@
             </w:r>
           </w:p>
         </w:tc>
+        <w:tc>
+          <w:tcPr>
+            <w:tcBorders>
+              <w:top w:color="cccccc" w:space="0" w:sz="6" w:val="single"/>
+              <w:left w:color="cccccc" w:space="0" w:sz="6" w:val="single"/>
+              <w:bottom w:color="cccccc" w:space="0" w:sz="6" w:val="single"/>
+              <w:right w:color="cccccc" w:space="0" w:sz="6" w:val="single"/>
+            </w:tcBorders>
+            <w:tcMar>
+              <w:top w:w="40.0" w:type="dxa"/>
+              <w:left w:w="40.0" w:type="dxa"/>
+              <w:bottom w:w="40.0" w:type="dxa"/>
+              <w:right w:w="40.0" w:type="dxa"/>
+            </w:tcMar>
+            <w:vAlign w:val="bottom"/>
+          </w:tcPr>
+          <w:p>
+            <w:pPr>
+              <w:widowControl w:val="0"/>
+              <w:jc w:val="center"/>
+              <w:rPr>
+                <w:sz w:val="20"/>
+                <w:szCs w:val="20"/>
+              </w:rPr>
+            </w:pPr>
+            <w:r>
+              <w:rPr>
+                <w:sz w:val="20"/>
+                <w:szCs w:val="20"/>
+                <w:rtl w:val="0"/>
+              </w:rPr>
+              <w:t xml:space="preserve">Done</w:t>
+            </w:r>
+          </w:p>
+        </w:tc>
+        <w:tc>
+          <w:tcPr>
+            <w:tcBorders>
+              <w:top w:color="cccccc" w:space="0" w:sz="6" w:val="single"/>
+              <w:left w:color="cccccc" w:space="0" w:sz="6" w:val="single"/>
+              <w:bottom w:color="cccccc" w:space="0" w:sz="6" w:val="single"/>
+              <w:right w:color="cccccc" w:space="0" w:sz="6" w:val="single"/>
+            </w:tcBorders>
+            <w:tcMar>
+              <w:top w:w="40.0" w:type="dxa"/>
+              <w:left w:w="40.0" w:type="dxa"/>
+              <w:bottom w:w="40.0" w:type="dxa"/>
+              <w:right w:w="40.0" w:type="dxa"/>
+            </w:tcMar>
+            <w:vAlign w:val="bottom"/>
+          </w:tcPr>
+          <w:p>
+            <w:pPr>
+              <w:widowControl w:val="0"/>
+              <w:jc w:val="center"/>
+              <w:rPr>
+                <w:sz w:val="20"/>
+                <w:szCs w:val="20"/>
+              </w:rPr>
+            </w:pPr>
+            <w:r>
+              <w:rPr>
+                <w:sz w:val="20"/>
+                <w:szCs w:val="20"/>
+                <w:rtl w:val="0"/>
+              </w:rPr>
+              <w:t xml:space="preserve">6</w:t>
+            </w:r>
+          </w:p>
+        </w:tc>
       </w:tr>
       <w:tr>
         <w:trPr>
@@ -1147,7 +1502,7 @@
               <w:widowControl w:val="0"/>
               <w:numPr>
                 <w:ilvl w:val="0"/>
-                <w:numId w:val="5"/>
+                <w:numId w:val="6"/>
               </w:numPr>
               <w:ind w:left="720" w:hanging="360"/>
               <w:jc w:val="center"/>
@@ -1171,7 +1526,7 @@
               <w:widowControl w:val="0"/>
               <w:numPr>
                 <w:ilvl w:val="0"/>
-                <w:numId w:val="5"/>
+                <w:numId w:val="6"/>
               </w:numPr>
               <w:ind w:left="720" w:hanging="360"/>
               <w:jc w:val="center"/>
@@ -1223,6 +1578,76 @@
                 <w:rtl w:val="0"/>
               </w:rPr>
               <w:t xml:space="preserve">Should-Have</w:t>
+            </w:r>
+          </w:p>
+        </w:tc>
+        <w:tc>
+          <w:tcPr>
+            <w:tcBorders>
+              <w:top w:color="cccccc" w:space="0" w:sz="6" w:val="single"/>
+              <w:left w:color="cccccc" w:space="0" w:sz="6" w:val="single"/>
+              <w:bottom w:color="cccccc" w:space="0" w:sz="6" w:val="single"/>
+              <w:right w:color="cccccc" w:space="0" w:sz="6" w:val="single"/>
+            </w:tcBorders>
+            <w:tcMar>
+              <w:top w:w="40.0" w:type="dxa"/>
+              <w:left w:w="40.0" w:type="dxa"/>
+              <w:bottom w:w="40.0" w:type="dxa"/>
+              <w:right w:w="40.0" w:type="dxa"/>
+            </w:tcMar>
+            <w:vAlign w:val="bottom"/>
+          </w:tcPr>
+          <w:p>
+            <w:pPr>
+              <w:widowControl w:val="0"/>
+              <w:jc w:val="center"/>
+              <w:rPr>
+                <w:sz w:val="20"/>
+                <w:szCs w:val="20"/>
+              </w:rPr>
+            </w:pPr>
+            <w:r>
+              <w:rPr>
+                <w:sz w:val="20"/>
+                <w:szCs w:val="20"/>
+                <w:rtl w:val="0"/>
+              </w:rPr>
+              <w:t xml:space="preserve">Done</w:t>
+            </w:r>
+          </w:p>
+        </w:tc>
+        <w:tc>
+          <w:tcPr>
+            <w:tcBorders>
+              <w:top w:color="cccccc" w:space="0" w:sz="6" w:val="single"/>
+              <w:left w:color="cccccc" w:space="0" w:sz="6" w:val="single"/>
+              <w:bottom w:color="cccccc" w:space="0" w:sz="6" w:val="single"/>
+              <w:right w:color="cccccc" w:space="0" w:sz="6" w:val="single"/>
+            </w:tcBorders>
+            <w:tcMar>
+              <w:top w:w="40.0" w:type="dxa"/>
+              <w:left w:w="40.0" w:type="dxa"/>
+              <w:bottom w:w="40.0" w:type="dxa"/>
+              <w:right w:w="40.0" w:type="dxa"/>
+            </w:tcMar>
+            <w:vAlign w:val="bottom"/>
+          </w:tcPr>
+          <w:p>
+            <w:pPr>
+              <w:widowControl w:val="0"/>
+              <w:jc w:val="center"/>
+              <w:rPr>
+                <w:sz w:val="20"/>
+                <w:szCs w:val="20"/>
+              </w:rPr>
+            </w:pPr>
+            <w:r>
+              <w:rPr>
+                <w:sz w:val="20"/>
+                <w:szCs w:val="20"/>
+                <w:rtl w:val="0"/>
+              </w:rPr>
+              <w:t xml:space="preserve">4</w:t>
             </w:r>
           </w:p>
         </w:tc>
@@ -1426,6 +1851,76 @@
             </w:r>
           </w:p>
         </w:tc>
+        <w:tc>
+          <w:tcPr>
+            <w:tcBorders>
+              <w:top w:color="cccccc" w:space="0" w:sz="6" w:val="single"/>
+              <w:left w:color="cccccc" w:space="0" w:sz="6" w:val="single"/>
+              <w:bottom w:color="cccccc" w:space="0" w:sz="6" w:val="single"/>
+              <w:right w:color="cccccc" w:space="0" w:sz="6" w:val="single"/>
+            </w:tcBorders>
+            <w:tcMar>
+              <w:top w:w="40.0" w:type="dxa"/>
+              <w:left w:w="40.0" w:type="dxa"/>
+              <w:bottom w:w="40.0" w:type="dxa"/>
+              <w:right w:w="40.0" w:type="dxa"/>
+            </w:tcMar>
+            <w:vAlign w:val="bottom"/>
+          </w:tcPr>
+          <w:p>
+            <w:pPr>
+              <w:widowControl w:val="0"/>
+              <w:jc w:val="center"/>
+              <w:rPr>
+                <w:sz w:val="20"/>
+                <w:szCs w:val="20"/>
+              </w:rPr>
+            </w:pPr>
+            <w:r>
+              <w:rPr>
+                <w:sz w:val="20"/>
+                <w:szCs w:val="20"/>
+                <w:rtl w:val="0"/>
+              </w:rPr>
+              <w:t xml:space="preserve">Done</w:t>
+            </w:r>
+          </w:p>
+        </w:tc>
+        <w:tc>
+          <w:tcPr>
+            <w:tcBorders>
+              <w:top w:color="cccccc" w:space="0" w:sz="6" w:val="single"/>
+              <w:left w:color="cccccc" w:space="0" w:sz="6" w:val="single"/>
+              <w:bottom w:color="cccccc" w:space="0" w:sz="6" w:val="single"/>
+              <w:right w:color="cccccc" w:space="0" w:sz="6" w:val="single"/>
+            </w:tcBorders>
+            <w:tcMar>
+              <w:top w:w="40.0" w:type="dxa"/>
+              <w:left w:w="40.0" w:type="dxa"/>
+              <w:bottom w:w="40.0" w:type="dxa"/>
+              <w:right w:w="40.0" w:type="dxa"/>
+            </w:tcMar>
+            <w:vAlign w:val="bottom"/>
+          </w:tcPr>
+          <w:p>
+            <w:pPr>
+              <w:widowControl w:val="0"/>
+              <w:jc w:val="center"/>
+              <w:rPr>
+                <w:sz w:val="20"/>
+                <w:szCs w:val="20"/>
+              </w:rPr>
+            </w:pPr>
+            <w:r>
+              <w:rPr>
+                <w:sz w:val="20"/>
+                <w:szCs w:val="20"/>
+                <w:rtl w:val="0"/>
+              </w:rPr>
+              <w:t xml:space="preserve">5</w:t>
+            </w:r>
+          </w:p>
+        </w:tc>
       </w:tr>
       <w:tr>
         <w:trPr>
@@ -1608,6 +2103,76 @@
             </w:r>
           </w:p>
         </w:tc>
+        <w:tc>
+          <w:tcPr>
+            <w:tcBorders>
+              <w:top w:color="cccccc" w:space="0" w:sz="6" w:val="single"/>
+              <w:left w:color="cccccc" w:space="0" w:sz="6" w:val="single"/>
+              <w:bottom w:color="cccccc" w:space="0" w:sz="6" w:val="single"/>
+              <w:right w:color="cccccc" w:space="0" w:sz="6" w:val="single"/>
+            </w:tcBorders>
+            <w:tcMar>
+              <w:top w:w="40.0" w:type="dxa"/>
+              <w:left w:w="40.0" w:type="dxa"/>
+              <w:bottom w:w="40.0" w:type="dxa"/>
+              <w:right w:w="40.0" w:type="dxa"/>
+            </w:tcMar>
+            <w:vAlign w:val="bottom"/>
+          </w:tcPr>
+          <w:p>
+            <w:pPr>
+              <w:widowControl w:val="0"/>
+              <w:jc w:val="center"/>
+              <w:rPr>
+                <w:sz w:val="20"/>
+                <w:szCs w:val="20"/>
+              </w:rPr>
+            </w:pPr>
+            <w:r>
+              <w:rPr>
+                <w:sz w:val="20"/>
+                <w:szCs w:val="20"/>
+                <w:rtl w:val="0"/>
+              </w:rPr>
+              <w:t xml:space="preserve">Functionality covered by AI coach</w:t>
+            </w:r>
+          </w:p>
+        </w:tc>
+        <w:tc>
+          <w:tcPr>
+            <w:tcBorders>
+              <w:top w:color="cccccc" w:space="0" w:sz="6" w:val="single"/>
+              <w:left w:color="cccccc" w:space="0" w:sz="6" w:val="single"/>
+              <w:bottom w:color="cccccc" w:space="0" w:sz="6" w:val="single"/>
+              <w:right w:color="cccccc" w:space="0" w:sz="6" w:val="single"/>
+            </w:tcBorders>
+            <w:tcMar>
+              <w:top w:w="40.0" w:type="dxa"/>
+              <w:left w:w="40.0" w:type="dxa"/>
+              <w:bottom w:w="40.0" w:type="dxa"/>
+              <w:right w:w="40.0" w:type="dxa"/>
+            </w:tcMar>
+            <w:vAlign w:val="bottom"/>
+          </w:tcPr>
+          <w:p>
+            <w:pPr>
+              <w:widowControl w:val="0"/>
+              <w:jc w:val="center"/>
+              <w:rPr>
+                <w:sz w:val="20"/>
+                <w:szCs w:val="20"/>
+              </w:rPr>
+            </w:pPr>
+            <w:r>
+              <w:rPr>
+                <w:sz w:val="20"/>
+                <w:szCs w:val="20"/>
+                <w:rtl w:val="0"/>
+              </w:rPr>
+              <w:t xml:space="preserve">3</w:t>
+            </w:r>
+          </w:p>
+        </w:tc>
       </w:tr>
       <w:tr>
         <w:trPr>
@@ -1790,6 +2355,76 @@
             </w:r>
           </w:p>
         </w:tc>
+        <w:tc>
+          <w:tcPr>
+            <w:tcBorders>
+              <w:top w:color="cccccc" w:space="0" w:sz="6" w:val="single"/>
+              <w:left w:color="cccccc" w:space="0" w:sz="6" w:val="single"/>
+              <w:bottom w:color="cccccc" w:space="0" w:sz="6" w:val="single"/>
+              <w:right w:color="cccccc" w:space="0" w:sz="6" w:val="single"/>
+            </w:tcBorders>
+            <w:tcMar>
+              <w:top w:w="40.0" w:type="dxa"/>
+              <w:left w:w="40.0" w:type="dxa"/>
+              <w:bottom w:w="40.0" w:type="dxa"/>
+              <w:right w:w="40.0" w:type="dxa"/>
+            </w:tcMar>
+            <w:vAlign w:val="bottom"/>
+          </w:tcPr>
+          <w:p>
+            <w:pPr>
+              <w:widowControl w:val="0"/>
+              <w:jc w:val="center"/>
+              <w:rPr>
+                <w:sz w:val="20"/>
+                <w:szCs w:val="20"/>
+              </w:rPr>
+            </w:pPr>
+            <w:r>
+              <w:rPr>
+                <w:sz w:val="20"/>
+                <w:szCs w:val="20"/>
+                <w:rtl w:val="0"/>
+              </w:rPr>
+              <w:t xml:space="preserve">Done</w:t>
+            </w:r>
+          </w:p>
+        </w:tc>
+        <w:tc>
+          <w:tcPr>
+            <w:tcBorders>
+              <w:top w:color="cccccc" w:space="0" w:sz="6" w:val="single"/>
+              <w:left w:color="cccccc" w:space="0" w:sz="6" w:val="single"/>
+              <w:bottom w:color="cccccc" w:space="0" w:sz="6" w:val="single"/>
+              <w:right w:color="cccccc" w:space="0" w:sz="6" w:val="single"/>
+            </w:tcBorders>
+            <w:tcMar>
+              <w:top w:w="40.0" w:type="dxa"/>
+              <w:left w:w="40.0" w:type="dxa"/>
+              <w:bottom w:w="40.0" w:type="dxa"/>
+              <w:right w:w="40.0" w:type="dxa"/>
+            </w:tcMar>
+            <w:vAlign w:val="bottom"/>
+          </w:tcPr>
+          <w:p>
+            <w:pPr>
+              <w:widowControl w:val="0"/>
+              <w:jc w:val="center"/>
+              <w:rPr>
+                <w:sz w:val="20"/>
+                <w:szCs w:val="20"/>
+              </w:rPr>
+            </w:pPr>
+            <w:r>
+              <w:rPr>
+                <w:sz w:val="20"/>
+                <w:szCs w:val="20"/>
+                <w:rtl w:val="0"/>
+              </w:rPr>
+              <w:t xml:space="preserve">2</w:t>
+            </w:r>
+          </w:p>
+        </w:tc>
       </w:tr>
       <w:tr>
         <w:trPr>
@@ -1923,7 +2558,7 @@
               <w:widowControl w:val="0"/>
               <w:numPr>
                 <w:ilvl w:val="0"/>
-                <w:numId w:val="7"/>
+                <w:numId w:val="8"/>
               </w:numPr>
               <w:ind w:left="720" w:hanging="360"/>
               <w:jc w:val="center"/>
@@ -1975,6 +2610,76 @@
                 <w:rtl w:val="0"/>
               </w:rPr>
               <w:t xml:space="preserve">Should-Have</w:t>
+            </w:r>
+          </w:p>
+        </w:tc>
+        <w:tc>
+          <w:tcPr>
+            <w:tcBorders>
+              <w:top w:color="cccccc" w:space="0" w:sz="6" w:val="single"/>
+              <w:left w:color="cccccc" w:space="0" w:sz="6" w:val="single"/>
+              <w:bottom w:color="cccccc" w:space="0" w:sz="6" w:val="single"/>
+              <w:right w:color="cccccc" w:space="0" w:sz="6" w:val="single"/>
+            </w:tcBorders>
+            <w:tcMar>
+              <w:top w:w="40.0" w:type="dxa"/>
+              <w:left w:w="40.0" w:type="dxa"/>
+              <w:bottom w:w="40.0" w:type="dxa"/>
+              <w:right w:w="40.0" w:type="dxa"/>
+            </w:tcMar>
+            <w:vAlign w:val="bottom"/>
+          </w:tcPr>
+          <w:p>
+            <w:pPr>
+              <w:widowControl w:val="0"/>
+              <w:jc w:val="center"/>
+              <w:rPr>
+                <w:sz w:val="20"/>
+                <w:szCs w:val="20"/>
+              </w:rPr>
+            </w:pPr>
+            <w:r>
+              <w:rPr>
+                <w:sz w:val="20"/>
+                <w:szCs w:val="20"/>
+                <w:rtl w:val="0"/>
+              </w:rPr>
+              <w:t xml:space="preserve">Done</w:t>
+            </w:r>
+          </w:p>
+        </w:tc>
+        <w:tc>
+          <w:tcPr>
+            <w:tcBorders>
+              <w:top w:color="cccccc" w:space="0" w:sz="6" w:val="single"/>
+              <w:left w:color="cccccc" w:space="0" w:sz="6" w:val="single"/>
+              <w:bottom w:color="cccccc" w:space="0" w:sz="6" w:val="single"/>
+              <w:right w:color="cccccc" w:space="0" w:sz="6" w:val="single"/>
+            </w:tcBorders>
+            <w:tcMar>
+              <w:top w:w="40.0" w:type="dxa"/>
+              <w:left w:w="40.0" w:type="dxa"/>
+              <w:bottom w:w="40.0" w:type="dxa"/>
+              <w:right w:w="40.0" w:type="dxa"/>
+            </w:tcMar>
+            <w:vAlign w:val="bottom"/>
+          </w:tcPr>
+          <w:p>
+            <w:pPr>
+              <w:widowControl w:val="0"/>
+              <w:jc w:val="center"/>
+              <w:rPr>
+                <w:sz w:val="20"/>
+                <w:szCs w:val="20"/>
+              </w:rPr>
+            </w:pPr>
+            <w:r>
+              <w:rPr>
+                <w:sz w:val="20"/>
+                <w:szCs w:val="20"/>
+                <w:rtl w:val="0"/>
+              </w:rPr>
+              <w:t xml:space="preserve">4</w:t>
             </w:r>
           </w:p>
         </w:tc>
@@ -2156,7 +2861,77 @@
                 <w:szCs w:val="20"/>
                 <w:rtl w:val="0"/>
               </w:rPr>
-              <w:t xml:space="preserve">Should-Have</w:t>
+              <w:t xml:space="preserve">Could-Have</w:t>
+            </w:r>
+          </w:p>
+        </w:tc>
+        <w:tc>
+          <w:tcPr>
+            <w:tcBorders>
+              <w:top w:color="cccccc" w:space="0" w:sz="6" w:val="single"/>
+              <w:left w:color="cccccc" w:space="0" w:sz="6" w:val="single"/>
+              <w:bottom w:color="cccccc" w:space="0" w:sz="6" w:val="single"/>
+              <w:right w:color="cccccc" w:space="0" w:sz="6" w:val="single"/>
+            </w:tcBorders>
+            <w:tcMar>
+              <w:top w:w="40.0" w:type="dxa"/>
+              <w:left w:w="40.0" w:type="dxa"/>
+              <w:bottom w:w="40.0" w:type="dxa"/>
+              <w:right w:w="40.0" w:type="dxa"/>
+            </w:tcMar>
+            <w:vAlign w:val="bottom"/>
+          </w:tcPr>
+          <w:p>
+            <w:pPr>
+              <w:widowControl w:val="0"/>
+              <w:jc w:val="center"/>
+              <w:rPr>
+                <w:sz w:val="20"/>
+                <w:szCs w:val="20"/>
+              </w:rPr>
+            </w:pPr>
+            <w:r>
+              <w:rPr>
+                <w:sz w:val="20"/>
+                <w:szCs w:val="20"/>
+                <w:rtl w:val="0"/>
+              </w:rPr>
+              <w:t xml:space="preserve">Will not implement</w:t>
+            </w:r>
+          </w:p>
+        </w:tc>
+        <w:tc>
+          <w:tcPr>
+            <w:tcBorders>
+              <w:top w:color="cccccc" w:space="0" w:sz="6" w:val="single"/>
+              <w:left w:color="cccccc" w:space="0" w:sz="6" w:val="single"/>
+              <w:bottom w:color="cccccc" w:space="0" w:sz="6" w:val="single"/>
+              <w:right w:color="cccccc" w:space="0" w:sz="6" w:val="single"/>
+            </w:tcBorders>
+            <w:tcMar>
+              <w:top w:w="40.0" w:type="dxa"/>
+              <w:left w:w="40.0" w:type="dxa"/>
+              <w:bottom w:w="40.0" w:type="dxa"/>
+              <w:right w:w="40.0" w:type="dxa"/>
+            </w:tcMar>
+            <w:vAlign w:val="bottom"/>
+          </w:tcPr>
+          <w:p>
+            <w:pPr>
+              <w:widowControl w:val="0"/>
+              <w:jc w:val="center"/>
+              <w:rPr>
+                <w:sz w:val="20"/>
+                <w:szCs w:val="20"/>
+              </w:rPr>
+            </w:pPr>
+            <w:r>
+              <w:rPr>
+                <w:sz w:val="20"/>
+                <w:szCs w:val="20"/>
+                <w:rtl w:val="0"/>
+              </w:rPr>
+              <w:t xml:space="preserve">4</w:t>
             </w:r>
           </w:p>
         </w:tc>
@@ -2342,6 +3117,76 @@
             </w:r>
           </w:p>
         </w:tc>
+        <w:tc>
+          <w:tcPr>
+            <w:tcBorders>
+              <w:top w:color="cccccc" w:space="0" w:sz="6" w:val="single"/>
+              <w:left w:color="cccccc" w:space="0" w:sz="6" w:val="single"/>
+              <w:bottom w:color="cccccc" w:space="0" w:sz="6" w:val="single"/>
+              <w:right w:color="cccccc" w:space="0" w:sz="6" w:val="single"/>
+            </w:tcBorders>
+            <w:tcMar>
+              <w:top w:w="40.0" w:type="dxa"/>
+              <w:left w:w="40.0" w:type="dxa"/>
+              <w:bottom w:w="40.0" w:type="dxa"/>
+              <w:right w:w="40.0" w:type="dxa"/>
+            </w:tcMar>
+            <w:vAlign w:val="bottom"/>
+          </w:tcPr>
+          <w:p>
+            <w:pPr>
+              <w:widowControl w:val="0"/>
+              <w:jc w:val="center"/>
+              <w:rPr>
+                <w:sz w:val="20"/>
+                <w:szCs w:val="20"/>
+              </w:rPr>
+            </w:pPr>
+            <w:r>
+              <w:rPr>
+                <w:sz w:val="20"/>
+                <w:szCs w:val="20"/>
+                <w:rtl w:val="0"/>
+              </w:rPr>
+              <w:t xml:space="preserve">Done</w:t>
+            </w:r>
+          </w:p>
+        </w:tc>
+        <w:tc>
+          <w:tcPr>
+            <w:tcBorders>
+              <w:top w:color="cccccc" w:space="0" w:sz="6" w:val="single"/>
+              <w:left w:color="cccccc" w:space="0" w:sz="6" w:val="single"/>
+              <w:bottom w:color="cccccc" w:space="0" w:sz="6" w:val="single"/>
+              <w:right w:color="cccccc" w:space="0" w:sz="6" w:val="single"/>
+            </w:tcBorders>
+            <w:tcMar>
+              <w:top w:w="40.0" w:type="dxa"/>
+              <w:left w:w="40.0" w:type="dxa"/>
+              <w:bottom w:w="40.0" w:type="dxa"/>
+              <w:right w:w="40.0" w:type="dxa"/>
+            </w:tcMar>
+            <w:vAlign w:val="bottom"/>
+          </w:tcPr>
+          <w:p>
+            <w:pPr>
+              <w:widowControl w:val="0"/>
+              <w:jc w:val="center"/>
+              <w:rPr>
+                <w:sz w:val="20"/>
+                <w:szCs w:val="20"/>
+              </w:rPr>
+            </w:pPr>
+            <w:r>
+              <w:rPr>
+                <w:sz w:val="20"/>
+                <w:szCs w:val="20"/>
+                <w:rtl w:val="0"/>
+              </w:rPr>
+              <w:t xml:space="preserve">3</w:t>
+            </w:r>
+          </w:p>
+        </w:tc>
       </w:tr>
       <w:tr>
         <w:trPr>
@@ -2475,7 +3320,7 @@
               <w:widowControl w:val="0"/>
               <w:numPr>
                 <w:ilvl w:val="0"/>
-                <w:numId w:val="6"/>
+                <w:numId w:val="7"/>
               </w:numPr>
               <w:ind w:left="720" w:hanging="360"/>
               <w:jc w:val="center"/>
@@ -2527,6 +3372,334 @@
                 <w:rtl w:val="0"/>
               </w:rPr>
               <w:t xml:space="preserve">Should-Have</w:t>
+            </w:r>
+          </w:p>
+        </w:tc>
+        <w:tc>
+          <w:tcPr>
+            <w:tcBorders>
+              <w:top w:color="cccccc" w:space="0" w:sz="6" w:val="single"/>
+              <w:left w:color="cccccc" w:space="0" w:sz="6" w:val="single"/>
+              <w:bottom w:color="cccccc" w:space="0" w:sz="6" w:val="single"/>
+              <w:right w:color="cccccc" w:space="0" w:sz="6" w:val="single"/>
+            </w:tcBorders>
+            <w:tcMar>
+              <w:top w:w="40.0" w:type="dxa"/>
+              <w:left w:w="40.0" w:type="dxa"/>
+              <w:bottom w:w="40.0" w:type="dxa"/>
+              <w:right w:w="40.0" w:type="dxa"/>
+            </w:tcMar>
+            <w:vAlign w:val="bottom"/>
+          </w:tcPr>
+          <w:p>
+            <w:pPr>
+              <w:widowControl w:val="0"/>
+              <w:jc w:val="center"/>
+              <w:rPr>
+                <w:sz w:val="20"/>
+                <w:szCs w:val="20"/>
+              </w:rPr>
+            </w:pPr>
+            <w:r>
+              <w:rPr>
+                <w:sz w:val="20"/>
+                <w:szCs w:val="20"/>
+                <w:rtl w:val="0"/>
+              </w:rPr>
+              <w:t xml:space="preserve">Done</w:t>
+            </w:r>
+          </w:p>
+        </w:tc>
+        <w:tc>
+          <w:tcPr>
+            <w:tcBorders>
+              <w:top w:color="cccccc" w:space="0" w:sz="6" w:val="single"/>
+              <w:left w:color="cccccc" w:space="0" w:sz="6" w:val="single"/>
+              <w:bottom w:color="cccccc" w:space="0" w:sz="6" w:val="single"/>
+              <w:right w:color="cccccc" w:space="0" w:sz="6" w:val="single"/>
+            </w:tcBorders>
+            <w:tcMar>
+              <w:top w:w="40.0" w:type="dxa"/>
+              <w:left w:w="40.0" w:type="dxa"/>
+              <w:bottom w:w="40.0" w:type="dxa"/>
+              <w:right w:w="40.0" w:type="dxa"/>
+            </w:tcMar>
+            <w:vAlign w:val="bottom"/>
+          </w:tcPr>
+          <w:p>
+            <w:pPr>
+              <w:widowControl w:val="0"/>
+              <w:jc w:val="center"/>
+              <w:rPr>
+                <w:sz w:val="20"/>
+                <w:szCs w:val="20"/>
+              </w:rPr>
+            </w:pPr>
+            <w:r>
+              <w:rPr>
+                <w:sz w:val="20"/>
+                <w:szCs w:val="20"/>
+                <w:rtl w:val="0"/>
+              </w:rPr>
+              <w:t xml:space="preserve">8</w:t>
+            </w:r>
+          </w:p>
+        </w:tc>
+      </w:tr>
+      <w:tr>
+        <w:trPr>
+          <w:cantSplit w:val="0"/>
+          <w:trHeight w:val="975" w:hRule="atLeast"/>
+          <w:tblHeader w:val="0"/>
+        </w:trPr>
+        <w:tc>
+          <w:tcPr>
+            <w:tcBorders>
+              <w:top w:color="cccccc" w:space="0" w:sz="6" w:val="single"/>
+              <w:left w:color="cccccc" w:space="0" w:sz="6" w:val="single"/>
+              <w:bottom w:color="cccccc" w:space="0" w:sz="6" w:val="single"/>
+              <w:right w:color="cccccc" w:space="0" w:sz="6" w:val="single"/>
+            </w:tcBorders>
+            <w:tcMar>
+              <w:top w:w="40.0" w:type="dxa"/>
+              <w:left w:w="40.0" w:type="dxa"/>
+              <w:bottom w:w="40.0" w:type="dxa"/>
+              <w:right w:w="40.0" w:type="dxa"/>
+            </w:tcMar>
+            <w:vAlign w:val="bottom"/>
+          </w:tcPr>
+          <w:p>
+            <w:pPr>
+              <w:widowControl w:val="0"/>
+              <w:jc w:val="center"/>
+              <w:rPr>
+                <w:sz w:val="20"/>
+                <w:szCs w:val="20"/>
+              </w:rPr>
+            </w:pPr>
+            <w:r>
+              <w:rPr>
+                <w:sz w:val="20"/>
+                <w:szCs w:val="20"/>
+                <w:rtl w:val="0"/>
+              </w:rPr>
+              <w:t xml:space="preserve">13</w:t>
+            </w:r>
+          </w:p>
+        </w:tc>
+        <w:tc>
+          <w:tcPr>
+            <w:tcBorders>
+              <w:top w:color="cccccc" w:space="0" w:sz="6" w:val="single"/>
+              <w:left w:color="cccccc" w:space="0" w:sz="6" w:val="single"/>
+              <w:bottom w:color="cccccc" w:space="0" w:sz="6" w:val="single"/>
+              <w:right w:color="cccccc" w:space="0" w:sz="6" w:val="single"/>
+            </w:tcBorders>
+            <w:tcMar>
+              <w:top w:w="40.0" w:type="dxa"/>
+              <w:left w:w="40.0" w:type="dxa"/>
+              <w:bottom w:w="40.0" w:type="dxa"/>
+              <w:right w:w="40.0" w:type="dxa"/>
+            </w:tcMar>
+            <w:vAlign w:val="bottom"/>
+          </w:tcPr>
+          <w:p>
+            <w:pPr>
+              <w:widowControl w:val="0"/>
+              <w:jc w:val="center"/>
+              <w:rPr>
+                <w:sz w:val="20"/>
+                <w:szCs w:val="20"/>
+              </w:rPr>
+            </w:pPr>
+            <w:r>
+              <w:rPr>
+                <w:sz w:val="20"/>
+                <w:szCs w:val="20"/>
+                <w:rtl w:val="0"/>
+              </w:rPr>
+              <w:t xml:space="preserve">Registration Criteria</w:t>
+            </w:r>
+          </w:p>
+        </w:tc>
+        <w:tc>
+          <w:tcPr>
+            <w:tcBorders>
+              <w:top w:color="cccccc" w:space="0" w:sz="6" w:val="single"/>
+              <w:left w:color="cccccc" w:space="0" w:sz="6" w:val="single"/>
+              <w:bottom w:color="cccccc" w:space="0" w:sz="6" w:val="single"/>
+              <w:right w:color="cccccc" w:space="0" w:sz="6" w:val="single"/>
+            </w:tcBorders>
+            <w:tcMar>
+              <w:top w:w="40.0" w:type="dxa"/>
+              <w:left w:w="40.0" w:type="dxa"/>
+              <w:bottom w:w="40.0" w:type="dxa"/>
+              <w:right w:w="40.0" w:type="dxa"/>
+            </w:tcMar>
+            <w:vAlign w:val="bottom"/>
+          </w:tcPr>
+          <w:p>
+            <w:pPr>
+              <w:widowControl w:val="0"/>
+              <w:jc w:val="center"/>
+              <w:rPr>
+                <w:sz w:val="20"/>
+                <w:szCs w:val="20"/>
+              </w:rPr>
+            </w:pPr>
+            <w:r>
+              <w:rPr>
+                <w:sz w:val="20"/>
+                <w:szCs w:val="20"/>
+                <w:rtl w:val="0"/>
+              </w:rPr>
+              <w:t xml:space="preserve">As a user, I want to register with a username, email and password that doesn’t contain any illegal characters and is secure.</w:t>
+            </w:r>
+          </w:p>
+        </w:tc>
+        <w:tc>
+          <w:tcPr>
+            <w:tcBorders>
+              <w:top w:color="cccccc" w:space="0" w:sz="6" w:val="single"/>
+              <w:left w:color="cccccc" w:space="0" w:sz="6" w:val="single"/>
+              <w:bottom w:color="cccccc" w:space="0" w:sz="6" w:val="single"/>
+              <w:right w:color="cccccc" w:space="0" w:sz="6" w:val="single"/>
+            </w:tcBorders>
+            <w:tcMar>
+              <w:top w:w="40.0" w:type="dxa"/>
+              <w:left w:w="40.0" w:type="dxa"/>
+              <w:bottom w:w="40.0" w:type="dxa"/>
+              <w:right w:w="40.0" w:type="dxa"/>
+            </w:tcMar>
+            <w:vAlign w:val="bottom"/>
+          </w:tcPr>
+          <w:p>
+            <w:pPr>
+              <w:widowControl w:val="0"/>
+              <w:numPr>
+                <w:ilvl w:val="0"/>
+                <w:numId w:val="1"/>
+              </w:numPr>
+              <w:ind w:left="720" w:hanging="360"/>
+              <w:jc w:val="center"/>
+              <w:rPr>
+                <w:sz w:val="20"/>
+                <w:szCs w:val="20"/>
+                <w:u w:val="none"/>
+              </w:rPr>
+            </w:pPr>
+            <w:r>
+              <w:rPr>
+                <w:sz w:val="20"/>
+                <w:szCs w:val="20"/>
+                <w:rtl w:val="0"/>
+              </w:rPr>
+              <w:t xml:space="preserve">Validators for Username, Email and Password</w:t>
+            </w:r>
+          </w:p>
+        </w:tc>
+        <w:tc>
+          <w:tcPr>
+            <w:tcBorders>
+              <w:top w:color="cccccc" w:space="0" w:sz="6" w:val="single"/>
+              <w:left w:color="cccccc" w:space="0" w:sz="6" w:val="single"/>
+              <w:bottom w:color="cccccc" w:space="0" w:sz="6" w:val="single"/>
+              <w:right w:color="cccccc" w:space="0" w:sz="6" w:val="single"/>
+            </w:tcBorders>
+            <w:tcMar>
+              <w:top w:w="40.0" w:type="dxa"/>
+              <w:left w:w="40.0" w:type="dxa"/>
+              <w:bottom w:w="40.0" w:type="dxa"/>
+              <w:right w:w="40.0" w:type="dxa"/>
+            </w:tcMar>
+            <w:vAlign w:val="bottom"/>
+          </w:tcPr>
+          <w:p>
+            <w:pPr>
+              <w:widowControl w:val="0"/>
+              <w:jc w:val="center"/>
+              <w:rPr>
+                <w:sz w:val="20"/>
+                <w:szCs w:val="20"/>
+              </w:rPr>
+            </w:pPr>
+            <w:r>
+              <w:rPr>
+                <w:sz w:val="20"/>
+                <w:szCs w:val="20"/>
+                <w:rtl w:val="0"/>
+              </w:rPr>
+              <w:t xml:space="preserve">Should-Have</w:t>
+            </w:r>
+          </w:p>
+        </w:tc>
+        <w:tc>
+          <w:tcPr>
+            <w:tcBorders>
+              <w:top w:color="cccccc" w:space="0" w:sz="6" w:val="single"/>
+              <w:left w:color="cccccc" w:space="0" w:sz="6" w:val="single"/>
+              <w:bottom w:color="cccccc" w:space="0" w:sz="6" w:val="single"/>
+              <w:right w:color="cccccc" w:space="0" w:sz="6" w:val="single"/>
+            </w:tcBorders>
+            <w:tcMar>
+              <w:top w:w="40.0" w:type="dxa"/>
+              <w:left w:w="40.0" w:type="dxa"/>
+              <w:bottom w:w="40.0" w:type="dxa"/>
+              <w:right w:w="40.0" w:type="dxa"/>
+            </w:tcMar>
+            <w:vAlign w:val="bottom"/>
+          </w:tcPr>
+          <w:p>
+            <w:pPr>
+              <w:widowControl w:val="0"/>
+              <w:jc w:val="center"/>
+              <w:rPr>
+                <w:sz w:val="20"/>
+                <w:szCs w:val="20"/>
+              </w:rPr>
+            </w:pPr>
+            <w:r>
+              <w:rPr>
+                <w:sz w:val="20"/>
+                <w:szCs w:val="20"/>
+                <w:rtl w:val="0"/>
+              </w:rPr>
+              <w:t xml:space="preserve">Done</w:t>
+            </w:r>
+          </w:p>
+        </w:tc>
+        <w:tc>
+          <w:tcPr>
+            <w:tcBorders>
+              <w:top w:color="cccccc" w:space="0" w:sz="6" w:val="single"/>
+              <w:left w:color="cccccc" w:space="0" w:sz="6" w:val="single"/>
+              <w:bottom w:color="cccccc" w:space="0" w:sz="6" w:val="single"/>
+              <w:right w:color="cccccc" w:space="0" w:sz="6" w:val="single"/>
+            </w:tcBorders>
+            <w:tcMar>
+              <w:top w:w="40.0" w:type="dxa"/>
+              <w:left w:w="40.0" w:type="dxa"/>
+              <w:bottom w:w="40.0" w:type="dxa"/>
+              <w:right w:w="40.0" w:type="dxa"/>
+            </w:tcMar>
+            <w:vAlign w:val="bottom"/>
+          </w:tcPr>
+          <w:p>
+            <w:pPr>
+              <w:widowControl w:val="0"/>
+              <w:jc w:val="center"/>
+              <w:rPr>
+                <w:sz w:val="20"/>
+                <w:szCs w:val="20"/>
+              </w:rPr>
+            </w:pPr>
+            <w:r>
+              <w:rPr>
+                <w:sz w:val="20"/>
+                <w:szCs w:val="20"/>
+                <w:rtl w:val="0"/>
+              </w:rPr>
+              <w:t xml:space="preserve">4</w:t>
             </w:r>
           </w:p>
         </w:tc>
@@ -2568,7 +3741,7 @@
                 <w:szCs w:val="20"/>
                 <w:rtl w:val="0"/>
               </w:rPr>
-              <w:t xml:space="preserve">13</w:t>
+              <w:t xml:space="preserve">14</w:t>
             </w:r>
           </w:p>
         </w:tc>
@@ -2663,7 +3836,7 @@
               <w:widowControl w:val="0"/>
               <w:numPr>
                 <w:ilvl w:val="0"/>
-                <w:numId w:val="4"/>
+                <w:numId w:val="5"/>
               </w:numPr>
               <w:ind w:left="720" w:hanging="360"/>
               <w:jc w:val="center"/>
@@ -2715,6 +3888,76 @@
                 <w:rtl w:val="0"/>
               </w:rPr>
               <w:t xml:space="preserve">Must-have</w:t>
+            </w:r>
+          </w:p>
+        </w:tc>
+        <w:tc>
+          <w:tcPr>
+            <w:tcBorders>
+              <w:top w:color="cccccc" w:space="0" w:sz="6" w:val="single"/>
+              <w:left w:color="cccccc" w:space="0" w:sz="6" w:val="single"/>
+              <w:bottom w:color="cccccc" w:space="0" w:sz="6" w:val="single"/>
+              <w:right w:color="cccccc" w:space="0" w:sz="6" w:val="single"/>
+            </w:tcBorders>
+            <w:tcMar>
+              <w:top w:w="40.0" w:type="dxa"/>
+              <w:left w:w="40.0" w:type="dxa"/>
+              <w:bottom w:w="40.0" w:type="dxa"/>
+              <w:right w:w="40.0" w:type="dxa"/>
+            </w:tcMar>
+            <w:vAlign w:val="bottom"/>
+          </w:tcPr>
+          <w:p>
+            <w:pPr>
+              <w:widowControl w:val="0"/>
+              <w:jc w:val="center"/>
+              <w:rPr>
+                <w:sz w:val="20"/>
+                <w:szCs w:val="20"/>
+              </w:rPr>
+            </w:pPr>
+            <w:r>
+              <w:rPr>
+                <w:sz w:val="20"/>
+                <w:szCs w:val="20"/>
+                <w:rtl w:val="0"/>
+              </w:rPr>
+              <w:t xml:space="preserve">Done</w:t>
+            </w:r>
+          </w:p>
+        </w:tc>
+        <w:tc>
+          <w:tcPr>
+            <w:tcBorders>
+              <w:top w:color="cccccc" w:space="0" w:sz="6" w:val="single"/>
+              <w:left w:color="cccccc" w:space="0" w:sz="6" w:val="single"/>
+              <w:bottom w:color="cccccc" w:space="0" w:sz="6" w:val="single"/>
+              <w:right w:color="cccccc" w:space="0" w:sz="6" w:val="single"/>
+            </w:tcBorders>
+            <w:tcMar>
+              <w:top w:w="40.0" w:type="dxa"/>
+              <w:left w:w="40.0" w:type="dxa"/>
+              <w:bottom w:w="40.0" w:type="dxa"/>
+              <w:right w:w="40.0" w:type="dxa"/>
+            </w:tcMar>
+            <w:vAlign w:val="bottom"/>
+          </w:tcPr>
+          <w:p>
+            <w:pPr>
+              <w:widowControl w:val="0"/>
+              <w:jc w:val="center"/>
+              <w:rPr>
+                <w:sz w:val="20"/>
+                <w:szCs w:val="20"/>
+              </w:rPr>
+            </w:pPr>
+            <w:r>
+              <w:rPr>
+                <w:sz w:val="20"/>
+                <w:szCs w:val="20"/>
+                <w:rtl w:val="0"/>
+              </w:rPr>
+              <w:t xml:space="preserve">15</w:t>
             </w:r>
           </w:p>
         </w:tc>
@@ -2756,7 +3999,7 @@
                 <w:szCs w:val="20"/>
                 <w:rtl w:val="0"/>
               </w:rPr>
-              <w:t xml:space="preserve">14</w:t>
+              <w:t xml:space="preserve">15</w:t>
             </w:r>
           </w:p>
         </w:tc>
@@ -2851,7 +4094,7 @@
               <w:widowControl w:val="0"/>
               <w:numPr>
                 <w:ilvl w:val="0"/>
-                <w:numId w:val="2"/>
+                <w:numId w:val="3"/>
               </w:numPr>
               <w:ind w:left="720" w:hanging="360"/>
               <w:jc w:val="center"/>
@@ -2875,7 +4118,7 @@
               <w:widowControl w:val="0"/>
               <w:numPr>
                 <w:ilvl w:val="0"/>
-                <w:numId w:val="2"/>
+                <w:numId w:val="3"/>
               </w:numPr>
               <w:ind w:left="720" w:hanging="360"/>
               <w:jc w:val="center"/>
@@ -2927,6 +4170,76 @@
                 <w:rtl w:val="0"/>
               </w:rPr>
               <w:t xml:space="preserve">Could-Have</w:t>
+            </w:r>
+          </w:p>
+        </w:tc>
+        <w:tc>
+          <w:tcPr>
+            <w:tcBorders>
+              <w:top w:color="cccccc" w:space="0" w:sz="6" w:val="single"/>
+              <w:left w:color="cccccc" w:space="0" w:sz="6" w:val="single"/>
+              <w:bottom w:color="cccccc" w:space="0" w:sz="6" w:val="single"/>
+              <w:right w:color="cccccc" w:space="0" w:sz="6" w:val="single"/>
+            </w:tcBorders>
+            <w:tcMar>
+              <w:top w:w="40.0" w:type="dxa"/>
+              <w:left w:w="40.0" w:type="dxa"/>
+              <w:bottom w:w="40.0" w:type="dxa"/>
+              <w:right w:w="40.0" w:type="dxa"/>
+            </w:tcMar>
+            <w:vAlign w:val="bottom"/>
+          </w:tcPr>
+          <w:p>
+            <w:pPr>
+              <w:widowControl w:val="0"/>
+              <w:jc w:val="center"/>
+              <w:rPr>
+                <w:sz w:val="20"/>
+                <w:szCs w:val="20"/>
+              </w:rPr>
+            </w:pPr>
+            <w:r>
+              <w:rPr>
+                <w:sz w:val="20"/>
+                <w:szCs w:val="20"/>
+                <w:rtl w:val="0"/>
+              </w:rPr>
+              <w:t xml:space="preserve">Done</w:t>
+            </w:r>
+          </w:p>
+        </w:tc>
+        <w:tc>
+          <w:tcPr>
+            <w:tcBorders>
+              <w:top w:color="cccccc" w:space="0" w:sz="6" w:val="single"/>
+              <w:left w:color="cccccc" w:space="0" w:sz="6" w:val="single"/>
+              <w:bottom w:color="cccccc" w:space="0" w:sz="6" w:val="single"/>
+              <w:right w:color="cccccc" w:space="0" w:sz="6" w:val="single"/>
+            </w:tcBorders>
+            <w:tcMar>
+              <w:top w:w="40.0" w:type="dxa"/>
+              <w:left w:w="40.0" w:type="dxa"/>
+              <w:bottom w:w="40.0" w:type="dxa"/>
+              <w:right w:w="40.0" w:type="dxa"/>
+            </w:tcMar>
+            <w:vAlign w:val="bottom"/>
+          </w:tcPr>
+          <w:p>
+            <w:pPr>
+              <w:widowControl w:val="0"/>
+              <w:jc w:val="center"/>
+              <w:rPr>
+                <w:sz w:val="20"/>
+                <w:szCs w:val="20"/>
+              </w:rPr>
+            </w:pPr>
+            <w:r>
+              <w:rPr>
+                <w:sz w:val="20"/>
+                <w:szCs w:val="20"/>
+                <w:rtl w:val="0"/>
+              </w:rPr>
+              <w:t xml:space="preserve">2</w:t>
             </w:r>
           </w:p>
         </w:tc>
@@ -2968,7 +4281,7 @@
                 <w:szCs w:val="20"/>
                 <w:rtl w:val="0"/>
               </w:rPr>
-              <w:t xml:space="preserve">15</w:t>
+              <w:t xml:space="preserve">16</w:t>
             </w:r>
           </w:p>
         </w:tc>
@@ -3109,6 +4422,76 @@
                 <w:rtl w:val="0"/>
               </w:rPr>
               <w:t xml:space="preserve">Could-Have</w:t>
+            </w:r>
+          </w:p>
+        </w:tc>
+        <w:tc>
+          <w:tcPr>
+            <w:tcBorders>
+              <w:top w:color="cccccc" w:space="0" w:sz="6" w:val="single"/>
+              <w:left w:color="cccccc" w:space="0" w:sz="6" w:val="single"/>
+              <w:bottom w:color="cccccc" w:space="0" w:sz="6" w:val="single"/>
+              <w:right w:color="cccccc" w:space="0" w:sz="6" w:val="single"/>
+            </w:tcBorders>
+            <w:tcMar>
+              <w:top w:w="40.0" w:type="dxa"/>
+              <w:left w:w="40.0" w:type="dxa"/>
+              <w:bottom w:w="40.0" w:type="dxa"/>
+              <w:right w:w="40.0" w:type="dxa"/>
+            </w:tcMar>
+            <w:vAlign w:val="bottom"/>
+          </w:tcPr>
+          <w:p>
+            <w:pPr>
+              <w:widowControl w:val="0"/>
+              <w:jc w:val="center"/>
+              <w:rPr>
+                <w:sz w:val="20"/>
+                <w:szCs w:val="20"/>
+              </w:rPr>
+            </w:pPr>
+            <w:r>
+              <w:rPr>
+                <w:sz w:val="20"/>
+                <w:szCs w:val="20"/>
+                <w:rtl w:val="0"/>
+              </w:rPr>
+              <w:t xml:space="preserve">Done</w:t>
+            </w:r>
+          </w:p>
+        </w:tc>
+        <w:tc>
+          <w:tcPr>
+            <w:tcBorders>
+              <w:top w:color="cccccc" w:space="0" w:sz="6" w:val="single"/>
+              <w:left w:color="cccccc" w:space="0" w:sz="6" w:val="single"/>
+              <w:bottom w:color="cccccc" w:space="0" w:sz="6" w:val="single"/>
+              <w:right w:color="cccccc" w:space="0" w:sz="6" w:val="single"/>
+            </w:tcBorders>
+            <w:tcMar>
+              <w:top w:w="40.0" w:type="dxa"/>
+              <w:left w:w="40.0" w:type="dxa"/>
+              <w:bottom w:w="40.0" w:type="dxa"/>
+              <w:right w:w="40.0" w:type="dxa"/>
+            </w:tcMar>
+            <w:vAlign w:val="bottom"/>
+          </w:tcPr>
+          <w:p>
+            <w:pPr>
+              <w:widowControl w:val="0"/>
+              <w:jc w:val="center"/>
+              <w:rPr>
+                <w:sz w:val="20"/>
+                <w:szCs w:val="20"/>
+              </w:rPr>
+            </w:pPr>
+            <w:r>
+              <w:rPr>
+                <w:sz w:val="20"/>
+                <w:szCs w:val="20"/>
+                <w:rtl w:val="0"/>
+              </w:rPr>
+              <w:t xml:space="preserve">9</w:t>
             </w:r>
           </w:p>
         </w:tc>
@@ -3150,7 +4533,7 @@
                 <w:szCs w:val="20"/>
                 <w:rtl w:val="0"/>
               </w:rPr>
-              <w:t xml:space="preserve">16</w:t>
+              <w:t xml:space="preserve">17</w:t>
             </w:r>
           </w:p>
         </w:tc>
@@ -3245,7 +4628,7 @@
               <w:widowControl w:val="0"/>
               <w:numPr>
                 <w:ilvl w:val="0"/>
-                <w:numId w:val="1"/>
+                <w:numId w:val="2"/>
               </w:numPr>
               <w:ind w:left="720" w:hanging="360"/>
               <w:jc w:val="center"/>
@@ -3297,6 +4680,76 @@
                 <w:rtl w:val="0"/>
               </w:rPr>
               <w:t xml:space="preserve">Must-Have</w:t>
+            </w:r>
+          </w:p>
+        </w:tc>
+        <w:tc>
+          <w:tcPr>
+            <w:tcBorders>
+              <w:top w:color="cccccc" w:space="0" w:sz="6" w:val="single"/>
+              <w:left w:color="cccccc" w:space="0" w:sz="6" w:val="single"/>
+              <w:bottom w:color="cccccc" w:space="0" w:sz="6" w:val="single"/>
+              <w:right w:color="cccccc" w:space="0" w:sz="6" w:val="single"/>
+            </w:tcBorders>
+            <w:tcMar>
+              <w:top w:w="40.0" w:type="dxa"/>
+              <w:left w:w="40.0" w:type="dxa"/>
+              <w:bottom w:w="40.0" w:type="dxa"/>
+              <w:right w:w="40.0" w:type="dxa"/>
+            </w:tcMar>
+            <w:vAlign w:val="bottom"/>
+          </w:tcPr>
+          <w:p>
+            <w:pPr>
+              <w:widowControl w:val="0"/>
+              <w:jc w:val="center"/>
+              <w:rPr>
+                <w:sz w:val="20"/>
+                <w:szCs w:val="20"/>
+              </w:rPr>
+            </w:pPr>
+            <w:r>
+              <w:rPr>
+                <w:sz w:val="20"/>
+                <w:szCs w:val="20"/>
+                <w:rtl w:val="0"/>
+              </w:rPr>
+              <w:t xml:space="preserve">Done</w:t>
+            </w:r>
+          </w:p>
+        </w:tc>
+        <w:tc>
+          <w:tcPr>
+            <w:tcBorders>
+              <w:top w:color="cccccc" w:space="0" w:sz="6" w:val="single"/>
+              <w:left w:color="cccccc" w:space="0" w:sz="6" w:val="single"/>
+              <w:bottom w:color="cccccc" w:space="0" w:sz="6" w:val="single"/>
+              <w:right w:color="cccccc" w:space="0" w:sz="6" w:val="single"/>
+            </w:tcBorders>
+            <w:tcMar>
+              <w:top w:w="40.0" w:type="dxa"/>
+              <w:left w:w="40.0" w:type="dxa"/>
+              <w:bottom w:w="40.0" w:type="dxa"/>
+              <w:right w:w="40.0" w:type="dxa"/>
+            </w:tcMar>
+            <w:vAlign w:val="bottom"/>
+          </w:tcPr>
+          <w:p>
+            <w:pPr>
+              <w:widowControl w:val="0"/>
+              <w:jc w:val="center"/>
+              <w:rPr>
+                <w:sz w:val="20"/>
+                <w:szCs w:val="20"/>
+              </w:rPr>
+            </w:pPr>
+            <w:r>
+              <w:rPr>
+                <w:sz w:val="20"/>
+                <w:szCs w:val="20"/>
+                <w:rtl w:val="0"/>
+              </w:rPr>
+              <w:t xml:space="preserve">15</w:t>
             </w:r>
           </w:p>
         </w:tc>
@@ -3338,7 +4791,7 @@
                 <w:szCs w:val="20"/>
                 <w:rtl w:val="0"/>
               </w:rPr>
-              <w:t xml:space="preserve">17</w:t>
+              <w:t xml:space="preserve">18</w:t>
             </w:r>
           </w:p>
         </w:tc>
@@ -3479,6 +4932,76 @@
                 <w:rtl w:val="0"/>
               </w:rPr>
               <w:t xml:space="preserve">Could-Have</w:t>
+            </w:r>
+          </w:p>
+        </w:tc>
+        <w:tc>
+          <w:tcPr>
+            <w:tcBorders>
+              <w:top w:color="cccccc" w:space="0" w:sz="6" w:val="single"/>
+              <w:left w:color="cccccc" w:space="0" w:sz="6" w:val="single"/>
+              <w:bottom w:color="cccccc" w:space="0" w:sz="6" w:val="single"/>
+              <w:right w:color="cccccc" w:space="0" w:sz="6" w:val="single"/>
+            </w:tcBorders>
+            <w:tcMar>
+              <w:top w:w="40.0" w:type="dxa"/>
+              <w:left w:w="40.0" w:type="dxa"/>
+              <w:bottom w:w="40.0" w:type="dxa"/>
+              <w:right w:w="40.0" w:type="dxa"/>
+            </w:tcMar>
+            <w:vAlign w:val="bottom"/>
+          </w:tcPr>
+          <w:p>
+            <w:pPr>
+              <w:widowControl w:val="0"/>
+              <w:jc w:val="center"/>
+              <w:rPr>
+                <w:sz w:val="20"/>
+                <w:szCs w:val="20"/>
+              </w:rPr>
+            </w:pPr>
+            <w:r>
+              <w:rPr>
+                <w:sz w:val="20"/>
+                <w:szCs w:val="20"/>
+                <w:rtl w:val="0"/>
+              </w:rPr>
+              <w:t xml:space="preserve">Will not implement</w:t>
+            </w:r>
+          </w:p>
+        </w:tc>
+        <w:tc>
+          <w:tcPr>
+            <w:tcBorders>
+              <w:top w:color="cccccc" w:space="0" w:sz="6" w:val="single"/>
+              <w:left w:color="cccccc" w:space="0" w:sz="6" w:val="single"/>
+              <w:bottom w:color="cccccc" w:space="0" w:sz="6" w:val="single"/>
+              <w:right w:color="cccccc" w:space="0" w:sz="6" w:val="single"/>
+            </w:tcBorders>
+            <w:tcMar>
+              <w:top w:w="40.0" w:type="dxa"/>
+              <w:left w:w="40.0" w:type="dxa"/>
+              <w:bottom w:w="40.0" w:type="dxa"/>
+              <w:right w:w="40.0" w:type="dxa"/>
+            </w:tcMar>
+            <w:vAlign w:val="bottom"/>
+          </w:tcPr>
+          <w:p>
+            <w:pPr>
+              <w:widowControl w:val="0"/>
+              <w:jc w:val="center"/>
+              <w:rPr>
+                <w:sz w:val="20"/>
+                <w:szCs w:val="20"/>
+              </w:rPr>
+            </w:pPr>
+            <w:r>
+              <w:rPr>
+                <w:sz w:val="20"/>
+                <w:szCs w:val="20"/>
+                <w:rtl w:val="0"/>
+              </w:rPr>
+              <w:t xml:space="preserve">10</w:t>
             </w:r>
           </w:p>
         </w:tc>
@@ -3520,7 +5043,7 @@
                 <w:szCs w:val="20"/>
                 <w:rtl w:val="0"/>
               </w:rPr>
-              <w:t xml:space="preserve">18</w:t>
+              <w:t xml:space="preserve">19</w:t>
             </w:r>
           </w:p>
         </w:tc>
@@ -3661,6 +5184,76 @@
                 <w:rtl w:val="0"/>
               </w:rPr>
               <w:t xml:space="preserve">Could-Have</w:t>
+            </w:r>
+          </w:p>
+        </w:tc>
+        <w:tc>
+          <w:tcPr>
+            <w:tcBorders>
+              <w:top w:color="cccccc" w:space="0" w:sz="6" w:val="single"/>
+              <w:left w:color="cccccc" w:space="0" w:sz="6" w:val="single"/>
+              <w:bottom w:color="cccccc" w:space="0" w:sz="6" w:val="single"/>
+              <w:right w:color="cccccc" w:space="0" w:sz="6" w:val="single"/>
+            </w:tcBorders>
+            <w:tcMar>
+              <w:top w:w="40.0" w:type="dxa"/>
+              <w:left w:w="40.0" w:type="dxa"/>
+              <w:bottom w:w="40.0" w:type="dxa"/>
+              <w:right w:w="40.0" w:type="dxa"/>
+            </w:tcMar>
+            <w:vAlign w:val="bottom"/>
+          </w:tcPr>
+          <w:p>
+            <w:pPr>
+              <w:widowControl w:val="0"/>
+              <w:jc w:val="center"/>
+              <w:rPr>
+                <w:sz w:val="20"/>
+                <w:szCs w:val="20"/>
+              </w:rPr>
+            </w:pPr>
+            <w:r>
+              <w:rPr>
+                <w:sz w:val="20"/>
+                <w:szCs w:val="20"/>
+                <w:rtl w:val="0"/>
+              </w:rPr>
+              <w:t xml:space="preserve">Will not implement</w:t>
+            </w:r>
+          </w:p>
+        </w:tc>
+        <w:tc>
+          <w:tcPr>
+            <w:tcBorders>
+              <w:top w:color="cccccc" w:space="0" w:sz="6" w:val="single"/>
+              <w:left w:color="cccccc" w:space="0" w:sz="6" w:val="single"/>
+              <w:bottom w:color="cccccc" w:space="0" w:sz="6" w:val="single"/>
+              <w:right w:color="cccccc" w:space="0" w:sz="6" w:val="single"/>
+            </w:tcBorders>
+            <w:tcMar>
+              <w:top w:w="40.0" w:type="dxa"/>
+              <w:left w:w="40.0" w:type="dxa"/>
+              <w:bottom w:w="40.0" w:type="dxa"/>
+              <w:right w:w="40.0" w:type="dxa"/>
+            </w:tcMar>
+            <w:vAlign w:val="bottom"/>
+          </w:tcPr>
+          <w:p>
+            <w:pPr>
+              <w:widowControl w:val="0"/>
+              <w:jc w:val="center"/>
+              <w:rPr>
+                <w:sz w:val="20"/>
+                <w:szCs w:val="20"/>
+              </w:rPr>
+            </w:pPr>
+            <w:r>
+              <w:rPr>
+                <w:sz w:val="20"/>
+                <w:szCs w:val="20"/>
+                <w:rtl w:val="0"/>
+              </w:rPr>
+              <w:t xml:space="preserve">10</w:t>
             </w:r>
           </w:p>
         </w:tc>
@@ -3702,7 +5295,7 @@
                 <w:szCs w:val="20"/>
                 <w:rtl w:val="0"/>
               </w:rPr>
-              <w:t xml:space="preserve">19</w:t>
+              <w:t xml:space="preserve">20</w:t>
             </w:r>
           </w:p>
         </w:tc>
@@ -3843,6 +5436,76 @@
                 <w:rtl w:val="0"/>
               </w:rPr>
               <w:t xml:space="preserve">Won't-Have</w:t>
+            </w:r>
+          </w:p>
+        </w:tc>
+        <w:tc>
+          <w:tcPr>
+            <w:tcBorders>
+              <w:top w:color="cccccc" w:space="0" w:sz="6" w:val="single"/>
+              <w:left w:color="cccccc" w:space="0" w:sz="6" w:val="single"/>
+              <w:bottom w:color="cccccc" w:space="0" w:sz="6" w:val="single"/>
+              <w:right w:color="cccccc" w:space="0" w:sz="6" w:val="single"/>
+            </w:tcBorders>
+            <w:tcMar>
+              <w:top w:w="40.0" w:type="dxa"/>
+              <w:left w:w="40.0" w:type="dxa"/>
+              <w:bottom w:w="40.0" w:type="dxa"/>
+              <w:right w:w="40.0" w:type="dxa"/>
+            </w:tcMar>
+            <w:vAlign w:val="bottom"/>
+          </w:tcPr>
+          <w:p>
+            <w:pPr>
+              <w:widowControl w:val="0"/>
+              <w:jc w:val="center"/>
+              <w:rPr>
+                <w:sz w:val="20"/>
+                <w:szCs w:val="20"/>
+              </w:rPr>
+            </w:pPr>
+            <w:r>
+              <w:rPr>
+                <w:sz w:val="20"/>
+                <w:szCs w:val="20"/>
+                <w:rtl w:val="0"/>
+              </w:rPr>
+              <w:t xml:space="preserve">Will not implement</w:t>
+            </w:r>
+          </w:p>
+        </w:tc>
+        <w:tc>
+          <w:tcPr>
+            <w:tcBorders>
+              <w:top w:color="cccccc" w:space="0" w:sz="6" w:val="single"/>
+              <w:left w:color="cccccc" w:space="0" w:sz="6" w:val="single"/>
+              <w:bottom w:color="cccccc" w:space="0" w:sz="6" w:val="single"/>
+              <w:right w:color="cccccc" w:space="0" w:sz="6" w:val="single"/>
+            </w:tcBorders>
+            <w:tcMar>
+              <w:top w:w="40.0" w:type="dxa"/>
+              <w:left w:w="40.0" w:type="dxa"/>
+              <w:bottom w:w="40.0" w:type="dxa"/>
+              <w:right w:w="40.0" w:type="dxa"/>
+            </w:tcMar>
+            <w:vAlign w:val="bottom"/>
+          </w:tcPr>
+          <w:p>
+            <w:pPr>
+              <w:widowControl w:val="0"/>
+              <w:jc w:val="center"/>
+              <w:rPr>
+                <w:sz w:val="20"/>
+                <w:szCs w:val="20"/>
+              </w:rPr>
+            </w:pPr>
+            <w:r>
+              <w:rPr>
+                <w:sz w:val="20"/>
+                <w:szCs w:val="20"/>
+                <w:rtl w:val="0"/>
+              </w:rPr>
+              <w:t xml:space="preserve">16</w:t>
             </w:r>
           </w:p>
         </w:tc>
@@ -3884,7 +5547,7 @@
                 <w:szCs w:val="20"/>
                 <w:rtl w:val="0"/>
               </w:rPr>
-              <w:t xml:space="preserve">20</w:t>
+              <w:t xml:space="preserve">21</w:t>
             </w:r>
           </w:p>
         </w:tc>
@@ -4025,6 +5688,76 @@
                 <w:rtl w:val="0"/>
               </w:rPr>
               <w:t xml:space="preserve">Could-Have</w:t>
+            </w:r>
+          </w:p>
+        </w:tc>
+        <w:tc>
+          <w:tcPr>
+            <w:tcBorders>
+              <w:top w:color="cccccc" w:space="0" w:sz="6" w:val="single"/>
+              <w:left w:color="cccccc" w:space="0" w:sz="6" w:val="single"/>
+              <w:bottom w:color="cccccc" w:space="0" w:sz="6" w:val="single"/>
+              <w:right w:color="cccccc" w:space="0" w:sz="6" w:val="single"/>
+            </w:tcBorders>
+            <w:tcMar>
+              <w:top w:w="40.0" w:type="dxa"/>
+              <w:left w:w="40.0" w:type="dxa"/>
+              <w:bottom w:w="40.0" w:type="dxa"/>
+              <w:right w:w="40.0" w:type="dxa"/>
+            </w:tcMar>
+            <w:vAlign w:val="bottom"/>
+          </w:tcPr>
+          <w:p>
+            <w:pPr>
+              <w:widowControl w:val="0"/>
+              <w:jc w:val="center"/>
+              <w:rPr>
+                <w:sz w:val="20"/>
+                <w:szCs w:val="20"/>
+              </w:rPr>
+            </w:pPr>
+            <w:r>
+              <w:rPr>
+                <w:sz w:val="20"/>
+                <w:szCs w:val="20"/>
+                <w:rtl w:val="0"/>
+              </w:rPr>
+              <w:t xml:space="preserve">Will not implement</w:t>
+            </w:r>
+          </w:p>
+        </w:tc>
+        <w:tc>
+          <w:tcPr>
+            <w:tcBorders>
+              <w:top w:color="cccccc" w:space="0" w:sz="6" w:val="single"/>
+              <w:left w:color="cccccc" w:space="0" w:sz="6" w:val="single"/>
+              <w:bottom w:color="cccccc" w:space="0" w:sz="6" w:val="single"/>
+              <w:right w:color="cccccc" w:space="0" w:sz="6" w:val="single"/>
+            </w:tcBorders>
+            <w:tcMar>
+              <w:top w:w="40.0" w:type="dxa"/>
+              <w:left w:w="40.0" w:type="dxa"/>
+              <w:bottom w:w="40.0" w:type="dxa"/>
+              <w:right w:w="40.0" w:type="dxa"/>
+            </w:tcMar>
+            <w:vAlign w:val="bottom"/>
+          </w:tcPr>
+          <w:p>
+            <w:pPr>
+              <w:widowControl w:val="0"/>
+              <w:jc w:val="center"/>
+              <w:rPr>
+                <w:sz w:val="20"/>
+                <w:szCs w:val="20"/>
+              </w:rPr>
+            </w:pPr>
+            <w:r>
+              <w:rPr>
+                <w:sz w:val="20"/>
+                <w:szCs w:val="20"/>
+                <w:rtl w:val="0"/>
+              </w:rPr>
+              <w:t xml:space="preserve">7</w:t>
             </w:r>
           </w:p>
         </w:tc>
@@ -4311,7 +6044,7 @@
       <w:lvlText w:val="%1."/>
       <w:lvlJc w:val="left"/>
       <w:pPr>
-        <w:ind w:left="1440" w:hanging="360"/>
+        <w:ind w:left="720" w:hanging="360"/>
       </w:pPr>
       <w:rPr>
         <w:u w:val="none"/>
@@ -4323,7 +6056,7 @@
       <w:lvlText w:val="%2."/>
       <w:lvlJc w:val="left"/>
       <w:pPr>
-        <w:ind w:left="2160" w:hanging="360"/>
+        <w:ind w:left="1440" w:hanging="360"/>
       </w:pPr>
       <w:rPr>
         <w:u w:val="none"/>
@@ -4335,7 +6068,7 @@
       <w:lvlText w:val="%3."/>
       <w:lvlJc w:val="right"/>
       <w:pPr>
-        <w:ind w:left="2880" w:hanging="360"/>
+        <w:ind w:left="2160" w:hanging="360"/>
       </w:pPr>
       <w:rPr>
         <w:u w:val="none"/>
@@ -4347,7 +6080,7 @@
       <w:lvlText w:val="%4."/>
       <w:lvlJc w:val="left"/>
       <w:pPr>
-        <w:ind w:left="3600" w:hanging="360"/>
+        <w:ind w:left="2880" w:hanging="360"/>
       </w:pPr>
       <w:rPr>
         <w:u w:val="none"/>
@@ -4359,7 +6092,7 @@
       <w:lvlText w:val="%5."/>
       <w:lvlJc w:val="left"/>
       <w:pPr>
-        <w:ind w:left="4320" w:hanging="360"/>
+        <w:ind w:left="3600" w:hanging="360"/>
       </w:pPr>
       <w:rPr>
         <w:u w:val="none"/>
@@ -4371,7 +6104,7 @@
       <w:lvlText w:val="%6."/>
       <w:lvlJc w:val="right"/>
       <w:pPr>
-        <w:ind w:left="5040" w:hanging="360"/>
+        <w:ind w:left="4320" w:hanging="360"/>
       </w:pPr>
       <w:rPr>
         <w:u w:val="none"/>
@@ -4383,7 +6116,7 @@
       <w:lvlText w:val="%7."/>
       <w:lvlJc w:val="left"/>
       <w:pPr>
-        <w:ind w:left="5760" w:hanging="360"/>
+        <w:ind w:left="5040" w:hanging="360"/>
       </w:pPr>
       <w:rPr>
         <w:u w:val="none"/>
@@ -4395,7 +6128,7 @@
       <w:lvlText w:val="%8."/>
       <w:lvlJc w:val="left"/>
       <w:pPr>
-        <w:ind w:left="6480" w:hanging="360"/>
+        <w:ind w:left="5760" w:hanging="360"/>
       </w:pPr>
       <w:rPr>
         <w:u w:val="none"/>
@@ -4407,7 +6140,7 @@
       <w:lvlText w:val="%9."/>
       <w:lvlJc w:val="right"/>
       <w:pPr>
-        <w:ind w:left="7200" w:hanging="360"/>
+        <w:ind w:left="6480" w:hanging="360"/>
       </w:pPr>
       <w:rPr>
         <w:u w:val="none"/>
@@ -4421,7 +6154,7 @@
       <w:lvlText w:val="%1."/>
       <w:lvlJc w:val="left"/>
       <w:pPr>
-        <w:ind w:left="720" w:hanging="360"/>
+        <w:ind w:left="1440" w:hanging="360"/>
       </w:pPr>
       <w:rPr>
         <w:u w:val="none"/>
@@ -4433,7 +6166,7 @@
       <w:lvlText w:val="%2."/>
       <w:lvlJc w:val="left"/>
       <w:pPr>
-        <w:ind w:left="1440" w:hanging="360"/>
+        <w:ind w:left="2160" w:hanging="360"/>
       </w:pPr>
       <w:rPr>
         <w:u w:val="none"/>
@@ -4445,7 +6178,7 @@
       <w:lvlText w:val="%3."/>
       <w:lvlJc w:val="right"/>
       <w:pPr>
-        <w:ind w:left="2160" w:hanging="360"/>
+        <w:ind w:left="2880" w:hanging="360"/>
       </w:pPr>
       <w:rPr>
         <w:u w:val="none"/>
@@ -4457,7 +6190,7 @@
       <w:lvlText w:val="%4."/>
       <w:lvlJc w:val="left"/>
       <w:pPr>
-        <w:ind w:left="2880" w:hanging="360"/>
+        <w:ind w:left="3600" w:hanging="360"/>
       </w:pPr>
       <w:rPr>
         <w:u w:val="none"/>
@@ -4469,7 +6202,7 @@
       <w:lvlText w:val="%5."/>
       <w:lvlJc w:val="left"/>
       <w:pPr>
-        <w:ind w:left="3600" w:hanging="360"/>
+        <w:ind w:left="4320" w:hanging="360"/>
       </w:pPr>
       <w:rPr>
         <w:u w:val="none"/>
@@ -4481,7 +6214,7 @@
       <w:lvlText w:val="%6."/>
       <w:lvlJc w:val="right"/>
       <w:pPr>
-        <w:ind w:left="4320" w:hanging="360"/>
+        <w:ind w:left="5040" w:hanging="360"/>
       </w:pPr>
       <w:rPr>
         <w:u w:val="none"/>
@@ -4493,7 +6226,7 @@
       <w:lvlText w:val="%7."/>
       <w:lvlJc w:val="left"/>
       <w:pPr>
-        <w:ind w:left="5040" w:hanging="360"/>
+        <w:ind w:left="5760" w:hanging="360"/>
       </w:pPr>
       <w:rPr>
         <w:u w:val="none"/>
@@ -4505,7 +6238,7 @@
       <w:lvlText w:val="%8."/>
       <w:lvlJc w:val="left"/>
       <w:pPr>
-        <w:ind w:left="5760" w:hanging="360"/>
+        <w:ind w:left="6480" w:hanging="360"/>
       </w:pPr>
       <w:rPr>
         <w:u w:val="none"/>
@@ -4517,7 +6250,7 @@
       <w:lvlText w:val="%9."/>
       <w:lvlJc w:val="right"/>
       <w:pPr>
-        <w:ind w:left="6480" w:hanging="360"/>
+        <w:ind w:left="7200" w:hanging="360"/>
       </w:pPr>
       <w:rPr>
         <w:u w:val="none"/>
@@ -4745,6 +6478,116 @@
     </w:lvl>
   </w:abstractNum>
   <w:abstractNum w:abstractNumId="7">
+    <w:lvl w:ilvl="0">
+      <w:start w:val="1"/>
+      <w:numFmt w:val="decimal"/>
+      <w:lvlText w:val="%1."/>
+      <w:lvlJc w:val="left"/>
+      <w:pPr>
+        <w:ind w:left="720" w:hanging="360"/>
+      </w:pPr>
+      <w:rPr>
+        <w:u w:val="none"/>
+      </w:rPr>
+    </w:lvl>
+    <w:lvl w:ilvl="1">
+      <w:start w:val="1"/>
+      <w:numFmt w:val="lowerLetter"/>
+      <w:lvlText w:val="%2."/>
+      <w:lvlJc w:val="left"/>
+      <w:pPr>
+        <w:ind w:left="1440" w:hanging="360"/>
+      </w:pPr>
+      <w:rPr>
+        <w:u w:val="none"/>
+      </w:rPr>
+    </w:lvl>
+    <w:lvl w:ilvl="2">
+      <w:start w:val="1"/>
+      <w:numFmt w:val="lowerRoman"/>
+      <w:lvlText w:val="%3."/>
+      <w:lvlJc w:val="right"/>
+      <w:pPr>
+        <w:ind w:left="2160" w:hanging="360"/>
+      </w:pPr>
+      <w:rPr>
+        <w:u w:val="none"/>
+      </w:rPr>
+    </w:lvl>
+    <w:lvl w:ilvl="3">
+      <w:start w:val="1"/>
+      <w:numFmt w:val="decimal"/>
+      <w:lvlText w:val="%4."/>
+      <w:lvlJc w:val="left"/>
+      <w:pPr>
+        <w:ind w:left="2880" w:hanging="360"/>
+      </w:pPr>
+      <w:rPr>
+        <w:u w:val="none"/>
+      </w:rPr>
+    </w:lvl>
+    <w:lvl w:ilvl="4">
+      <w:start w:val="1"/>
+      <w:numFmt w:val="lowerLetter"/>
+      <w:lvlText w:val="%5."/>
+      <w:lvlJc w:val="left"/>
+      <w:pPr>
+        <w:ind w:left="3600" w:hanging="360"/>
+      </w:pPr>
+      <w:rPr>
+        <w:u w:val="none"/>
+      </w:rPr>
+    </w:lvl>
+    <w:lvl w:ilvl="5">
+      <w:start w:val="1"/>
+      <w:numFmt w:val="lowerRoman"/>
+      <w:lvlText w:val="%6."/>
+      <w:lvlJc w:val="right"/>
+      <w:pPr>
+        <w:ind w:left="4320" w:hanging="360"/>
+      </w:pPr>
+      <w:rPr>
+        <w:u w:val="none"/>
+      </w:rPr>
+    </w:lvl>
+    <w:lvl w:ilvl="6">
+      <w:start w:val="1"/>
+      <w:numFmt w:val="decimal"/>
+      <w:lvlText w:val="%7."/>
+      <w:lvlJc w:val="left"/>
+      <w:pPr>
+        <w:ind w:left="5040" w:hanging="360"/>
+      </w:pPr>
+      <w:rPr>
+        <w:u w:val="none"/>
+      </w:rPr>
+    </w:lvl>
+    <w:lvl w:ilvl="7">
+      <w:start w:val="1"/>
+      <w:numFmt w:val="lowerLetter"/>
+      <w:lvlText w:val="%8."/>
+      <w:lvlJc w:val="left"/>
+      <w:pPr>
+        <w:ind w:left="5760" w:hanging="360"/>
+      </w:pPr>
+      <w:rPr>
+        <w:u w:val="none"/>
+      </w:rPr>
+    </w:lvl>
+    <w:lvl w:ilvl="8">
+      <w:start w:val="1"/>
+      <w:numFmt w:val="lowerRoman"/>
+      <w:lvlText w:val="%9."/>
+      <w:lvlJc w:val="right"/>
+      <w:pPr>
+        <w:ind w:left="6480" w:hanging="360"/>
+      </w:pPr>
+      <w:rPr>
+        <w:u w:val="none"/>
+      </w:rPr>
+    </w:lvl>
+  </w:abstractNum>
+  <w:abstractNum w:abstractNumId="8">
     <w:lvl w:ilvl="0">
       <w:start w:val="1"/>
       <w:numFmt w:val="decimal"/>
@@ -4874,6 +6717,9 @@
   </w:num>
   <w:num w:numId="7">
     <w:abstractNumId w:val="7"/>
+  </w:num>
+  <w:num w:numId="8">
+    <w:abstractNumId w:val="8"/>
   </w:num>
 </w:numbering>
 </file>

</xml_diff>